<commit_message>
ISO W10 sapuan SOP OPS: OPS-SOP-03, OPS-SOP-05 (putaran 2)
Co-Authored-By: Claude Opus 5.5 <noreply@anthropic.com>
Claude-Session: https://claude.ai/code/session_01BhkCQM7h3krZb9kjY2Nate
</commit_message>
<xml_diff>
--- a/out/07_Ops/SNX-OPS-SOP-03 Preventive & Corrective Maintenance (Rev00 DRAFT).docx
+++ b/out/07_Ops/SNX-OPS-SOP-03 Preventive & Corrective Maintenance (Rev00 DRAFT).docx
@@ -217,6 +217,7 @@
     <w:p>
       <w:pPr>
         <w:pStyle w:val="Heading1"/>
+        <w:keepNext/>
         <w:widowControl w:val="0"/>
         <w:spacing w:line="240" w:lineRule="auto"/>
         <w:ind w:right="407" w:firstLine="0"/>
@@ -511,6 +512,10 @@
         <w:gridCol w:w="5850"/>
       </w:tblGrid>
       <w:tr>
+        <w:trPr>
+          <w:cantSplit/>
+          <w:tblHeader/>
+        </w:trPr>
         <w:tc>
           <w:tcPr>
             <w:tcW w:w="3150" w:type="dxa"/>
@@ -523,6 +528,7 @@
           </w:tcPr>
           <w:p>
             <w:pPr>
+              <w:keepNext/>
               <w:widowControl w:val="0"/>
               <w:pBdr>
                 <w:top w:val="nil"/>
@@ -563,6 +569,7 @@
           </w:tcPr>
           <w:p>
             <w:pPr>
+              <w:keepNext/>
               <w:widowControl w:val="0"/>
               <w:pBdr>
                 <w:top w:val="nil"/>
@@ -593,6 +600,9 @@
         </w:tc>
       </w:tr>
       <w:tr>
+        <w:trPr>
+          <w:cantSplit/>
+        </w:trPr>
         <w:tc>
           <w:tcPr>
             <w:tcW w:w="3150" w:type="dxa"/>
@@ -646,6 +656,9 @@
         </w:tc>
       </w:tr>
       <w:tr>
+        <w:trPr>
+          <w:cantSplit/>
+        </w:trPr>
         <w:tc>
           <w:tcPr>
             <w:tcW w:w="3150" w:type="dxa"/>
@@ -699,6 +712,9 @@
         </w:tc>
       </w:tr>
       <w:tr>
+        <w:trPr>
+          <w:cantSplit/>
+        </w:trPr>
         <w:tc>
           <w:tcPr>
             <w:tcW w:w="3150" w:type="dxa"/>
@@ -750,6 +766,9 @@
         </w:tc>
       </w:tr>
       <w:tr>
+        <w:trPr>
+          <w:cantSplit/>
+        </w:trPr>
         <w:tc>
           <w:tcPr>
             <w:tcW w:w="3150" w:type="dxa"/>
@@ -810,6 +829,9 @@
         </w:tc>
       </w:tr>
       <w:tr>
+        <w:trPr>
+          <w:cantSplit/>
+        </w:trPr>
         <w:tc>
           <w:tcPr>
             <w:tcW w:w="3150" w:type="dxa"/>
@@ -861,6 +883,9 @@
         </w:tc>
       </w:tr>
       <w:tr>
+        <w:trPr>
+          <w:cantSplit/>
+        </w:trPr>
         <w:tc>
           <w:tcPr>
             <w:tcW w:w="3150" w:type="dxa"/>
@@ -914,6 +939,9 @@
         </w:tc>
       </w:tr>
       <w:tr>
+        <w:trPr>
+          <w:cantSplit/>
+        </w:trPr>
         <w:tc>
           <w:tcPr>
             <w:tcW w:w="3150" w:type="dxa"/>
@@ -967,6 +995,9 @@
         </w:tc>
       </w:tr>
       <w:tr>
+        <w:trPr>
+          <w:cantSplit/>
+        </w:trPr>
         <w:tc>
           <w:tcPr>
             <w:tcW w:w="3150" w:type="dxa"/>
@@ -1020,6 +1051,9 @@
         </w:tc>
       </w:tr>
       <w:tr>
+        <w:trPr>
+          <w:cantSplit/>
+        </w:trPr>
         <w:tc>
           <w:tcPr>
             <w:tcW w:w="3150" w:type="dxa"/>
@@ -1073,6 +1107,9 @@
         </w:tc>
       </w:tr>
       <w:tr>
+        <w:trPr>
+          <w:cantSplit/>
+        </w:trPr>
         <w:tc>
           <w:tcPr>
             <w:tcW w:w="3150" w:type="dxa"/>
@@ -1126,6 +1163,9 @@
         </w:tc>
       </w:tr>
       <w:tr>
+        <w:trPr>
+          <w:cantSplit/>
+        </w:trPr>
         <w:tc>
           <w:tcPr>
             <w:tcW w:w="3150" w:type="dxa"/>
@@ -1207,6 +1247,7 @@
     <w:p>
       <w:pPr>
         <w:pStyle w:val="Heading1"/>
+        <w:keepNext/>
         <w:widowControl w:val="0"/>
         <w:spacing w:before="816" w:line="240" w:lineRule="auto"/>
         <w:ind w:right="407"/>
@@ -1243,6 +1284,10 @@
         <w:gridCol w:w="3010"/>
       </w:tblGrid>
       <w:tr>
+        <w:trPr>
+          <w:cantSplit/>
+          <w:tblHeader/>
+        </w:trPr>
         <w:tc>
           <w:tcPr>
             <w:tcW w:w="3009" w:type="dxa"/>
@@ -1255,6 +1300,7 @@
           </w:tcPr>
           <w:p>
             <w:pPr>
+              <w:keepNext/>
               <w:widowControl w:val="0"/>
               <w:spacing w:line="240" w:lineRule="auto"/>
               <w:jc w:val="center"/>
@@ -1288,6 +1334,7 @@
           </w:tcPr>
           <w:p>
             <w:pPr>
+              <w:keepNext/>
               <w:widowControl w:val="0"/>
               <w:spacing w:line="240" w:lineRule="auto"/>
               <w:jc w:val="center"/>
@@ -1321,6 +1368,7 @@
           </w:tcPr>
           <w:p>
             <w:pPr>
+              <w:keepNext/>
               <w:widowControl w:val="0"/>
               <w:spacing w:line="240" w:lineRule="auto"/>
               <w:jc w:val="center"/>
@@ -1344,6 +1392,9 @@
         </w:tc>
       </w:tr>
       <w:tr>
+        <w:trPr>
+          <w:cantSplit/>
+        </w:trPr>
         <w:tc>
           <w:tcPr>
             <w:tcW w:w="3009" w:type="dxa"/>
@@ -1392,6 +1443,9 @@
         </w:tc>
       </w:tr>
       <w:tr>
+        <w:trPr>
+          <w:cantSplit/>
+        </w:trPr>
         <w:tc>
           <w:tcPr>
             <w:tcW w:w="3009" w:type="dxa"/>
@@ -1463,6 +1517,9 @@
         </w:tc>
       </w:tr>
       <w:tr>
+        <w:trPr>
+          <w:cantSplit/>
+        </w:trPr>
         <w:tc>
           <w:tcPr>
             <w:tcW w:w="3009" w:type="dxa"/>
@@ -1537,6 +1594,7 @@
     <w:p>
       <w:pPr>
         <w:pStyle w:val="Heading1"/>
+        <w:keepNext/>
         <w:widowControl w:val="0"/>
         <w:spacing w:before="816" w:line="240" w:lineRule="auto"/>
         <w:ind w:right="407"/>
@@ -1578,6 +1636,10 @@
         <w:gridCol w:w="2235"/>
       </w:tblGrid>
       <w:tr>
+        <w:trPr>
+          <w:cantSplit/>
+          <w:tblHeader/>
+        </w:trPr>
         <w:tc>
           <w:tcPr>
             <w:tcW w:w="810" w:type="dxa"/>
@@ -1590,6 +1652,7 @@
           </w:tcPr>
           <w:p>
             <w:pPr>
+              <w:keepNext/>
               <w:widowControl w:val="0"/>
               <w:pBdr>
                 <w:top w:val="nil"/>
@@ -1630,6 +1693,7 @@
           </w:tcPr>
           <w:p>
             <w:pPr>
+              <w:keepNext/>
               <w:widowControl w:val="0"/>
               <w:spacing w:line="240" w:lineRule="auto"/>
               <w:jc w:val="center"/>
@@ -1663,6 +1727,7 @@
           </w:tcPr>
           <w:p>
             <w:pPr>
+              <w:keepNext/>
               <w:widowControl w:val="0"/>
               <w:pBdr>
                 <w:top w:val="nil"/>
@@ -1703,6 +1768,7 @@
           </w:tcPr>
           <w:p>
             <w:pPr>
+              <w:keepNext/>
               <w:widowControl w:val="0"/>
               <w:pBdr>
                 <w:top w:val="nil"/>
@@ -1733,6 +1799,9 @@
         </w:tc>
       </w:tr>
       <w:tr>
+        <w:trPr>
+          <w:cantSplit/>
+        </w:trPr>
         <w:tc>
           <w:tcPr>
             <w:tcW w:w="810" w:type="dxa"/>
@@ -1835,6 +1904,9 @@
         </w:tc>
       </w:tr>
       <w:tr>
+        <w:trPr>
+          <w:cantSplit/>
+        </w:trPr>
         <w:tc>
           <w:tcPr>
             <w:tcW w:w="810" w:type="dxa"/>
@@ -1937,6 +2009,9 @@
         </w:tc>
       </w:tr>
       <w:tr>
+        <w:trPr>
+          <w:cantSplit/>
+        </w:trPr>
         <w:tc>
           <w:tcPr>
             <w:tcW w:w="810" w:type="dxa"/>
@@ -2394,7 +2469,7 @@
           <w:sz w:val="24"/>
           <w:szCs w:val="24"/>
         </w:rPr>
-        <w:t xml:space="preserve">SOP ini memastikan infrastruktur dan layanan yang dikelola SINUX dirawat secara terencana (preventive maintenance) dan diperbaiki secara terkendali saat terjadi kerusakan atau penurunan kinerja (corrective maintenance), sehingga availability layanan terjaga dan kejadian berulang dapat dicegah.</w:t>
+        <w:t xml:space="preserve">SOP ini memastikan infrastruktur dan layanan yang dikelola SINUX dirawat secara terencana (preventive maintenance) dan diperbaiki secara terkendali saat terjadi kerusakan atau penurunan kinerja (corrective maintenance). Dengan begitu, availability layanan terjaga dan kejadian berulang dapat dicegah.</w:t>
       </w:r>
     </w:p>
     <w:p>
@@ -2433,7 +2508,7 @@
           <w:sz w:val="24"/>
           <w:szCs w:val="24"/>
         </w:rPr>
-        <w:t xml:space="preserve">Berlaku untuk perangkat, platform, dan layanan yang dikelola SINUX: VM dan platform Nusagrid, server WHM dan cPanel, network device, WAF dan proxy, sistem monitoring, sistem backup, serta sistem internal pendukung operasi (sistem tiket Zammad, Jumphost, password manager).</w:t>
+        <w:t xml:space="preserve">Berlaku untuk perangkat, platform, dan layanan yang dikelola SINUX: VM dan platform Nusagrid, server WHM dan cPanel, network device, WAF dan proxy, sistem monitoring, sistem backup, serta sistem internal pendukung operasi (sistem ticket Zammad, Jumphost, password manager).</w:t>
       </w:r>
     </w:p>
     <w:p>
@@ -2487,6 +2562,7 @@
     <w:p>
       <w:pPr>
         <w:pStyle w:val="Heading1"/>
+        <w:keepNext/>
         <w:numPr>
           <w:ilvl w:val="0"/>
           <w:numId w:val="7"/>
@@ -2521,6 +2597,8 @@
       </w:tblGrid>
       <w:tr>
         <w:trPr>
+          <w:cantSplit/>
+          <w:tblHeader/>
           <w:jc w:val="center"/>
         </w:trPr>
         <w:tc>
@@ -2530,6 +2608,7 @@
           </w:tcPr>
           <w:p>
             <w:pPr>
+              <w:keepNext/>
               <w:jc w:val="center"/>
               <w:rPr>
                 <w:sz w:val="24"/>
@@ -2554,6 +2633,7 @@
           </w:tcPr>
           <w:p>
             <w:pPr>
+              <w:keepNext/>
               <w:jc w:val="center"/>
               <w:rPr>
                 <w:sz w:val="24"/>
@@ -2574,6 +2654,7 @@
       </w:tr>
       <w:tr>
         <w:trPr>
+          <w:cantSplit/>
           <w:jc w:val="center"/>
         </w:trPr>
         <w:tc>
@@ -2623,6 +2704,7 @@
       </w:tr>
       <w:tr>
         <w:trPr>
+          <w:cantSplit/>
           <w:jc w:val="center"/>
         </w:trPr>
         <w:tc>
@@ -2672,6 +2754,7 @@
       </w:tr>
       <w:tr>
         <w:trPr>
+          <w:cantSplit/>
           <w:jc w:val="center"/>
         </w:trPr>
         <w:tc>
@@ -2721,6 +2804,7 @@
       </w:tr>
       <w:tr>
         <w:trPr>
+          <w:cantSplit/>
           <w:jc w:val="center"/>
         </w:trPr>
         <w:tc>
@@ -2763,13 +2847,14 @@
                 <w:sz w:val="24"/>
                 <w:szCs w:val="24"/>
               </w:rPr>
-              <w:t>Sub divisi Divisi Operation yang memantau dashboard layanan dan menangani tiket.</w:t>
+              <w:t>Sub divisi Divisi Operation yang memantau dashboard layanan dan menangani ticket.</w:t>
             </w:r>
           </w:p>
         </w:tc>
       </w:tr>
       <w:tr>
         <w:trPr>
+          <w:cantSplit/>
           <w:jc w:val="center"/>
         </w:trPr>
         <w:tc>
@@ -2819,6 +2904,7 @@
       </w:tr>
       <w:tr>
         <w:trPr>
+          <w:cantSplit/>
           <w:jc w:val="center"/>
         </w:trPr>
         <w:tc>
@@ -2868,6 +2954,7 @@
       </w:tr>
       <w:tr>
         <w:trPr>
+          <w:cantSplit/>
           <w:jc w:val="center"/>
         </w:trPr>
         <w:tc>
@@ -2910,13 +2997,14 @@
                 <w:sz w:val="24"/>
                 <w:szCs w:val="24"/>
               </w:rPr>
-              <w:t>Perawatan terjadwal untuk mencegah gangguan. Aktivitas minimalnya ada di bagian 8.</w:t>
+              <w:t>Perawatan terjadwal untuk mencegah gangguan.</w:t>
             </w:r>
           </w:p>
         </w:tc>
       </w:tr>
       <w:tr>
         <w:trPr>
+          <w:cantSplit/>
           <w:jc w:val="center"/>
         </w:trPr>
         <w:tc>
@@ -2966,6 +3054,7 @@
       </w:tr>
       <w:tr>
         <w:trPr>
+          <w:cantSplit/>
           <w:jc w:val="center"/>
         </w:trPr>
         <w:tc>
@@ -3008,13 +3097,14 @@
                 <w:sz w:val="24"/>
                 <w:szCs w:val="24"/>
               </w:rPr>
-              <w:t>Root cause analysis: analisis untuk menemukan akar penyebab, bukan sekadar gejala.</w:t>
+              <w:t>Root cause analysis, yaitu analisis untuk menemukan root cause (akar masalah), bukan sekadar gejala.</w:t>
             </w:r>
           </w:p>
         </w:tc>
       </w:tr>
       <w:tr>
         <w:trPr>
+          <w:cantSplit/>
           <w:jc w:val="center"/>
         </w:trPr>
         <w:tc>
@@ -3057,13 +3147,14 @@
                 <w:sz w:val="24"/>
                 <w:szCs w:val="24"/>
               </w:rPr>
-              <w:t>Rekaman satu pelaksanaan PM atau CM di sheet Service Report SNX-OPS-FRM-07.</w:t>
+              <w:t>Record satu pelaksanaan PM atau CM di sheet Service Report SNX-OPS-FRM-07.</w:t>
             </w:r>
           </w:p>
         </w:tc>
       </w:tr>
       <w:tr>
         <w:trPr>
+          <w:cantSplit/>
           <w:jc w:val="center"/>
         </w:trPr>
         <w:tc>
@@ -3106,13 +3197,14 @@
                 <w:sz w:val="24"/>
                 <w:szCs w:val="24"/>
               </w:rPr>
-              <w:t>Tingkat keparahan tiket dari P1 sampai P4 menurut SNX-OPS-SOP-04.</w:t>
+              <w:t>Tingkat keparahan ticket dari P1 sampai P4 menurut SNX-OPS-SOP-04.</w:t>
             </w:r>
           </w:p>
         </w:tc>
       </w:tr>
       <w:tr>
         <w:trPr>
+          <w:cantSplit/>
           <w:jc w:val="center"/>
         </w:trPr>
         <w:tc>
@@ -3162,6 +3254,7 @@
       </w:tr>
       <w:tr>
         <w:trPr>
+          <w:cantSplit/>
           <w:jc w:val="center"/>
         </w:trPr>
         <w:tc>
@@ -3211,6 +3304,7 @@
       </w:tr>
       <w:tr>
         <w:trPr>
+          <w:cantSplit/>
           <w:jc w:val="center"/>
         </w:trPr>
         <w:tc>
@@ -3253,7 +3347,7 @@
                 <w:sz w:val="24"/>
                 <w:szCs w:val="24"/>
               </w:rPr>
-              <w:t>Sistem tiket yang dipakai Operation.</w:t>
+              <w:t>Sistem ticket yang dipakai Operation.</w:t>
             </w:r>
           </w:p>
         </w:tc>
@@ -3311,7 +3405,7 @@
           <w:sz w:val="24"/>
           <w:szCs w:val="24"/>
         </w:rPr>
-        <w:t xml:space="preserve">Infrastruktur dan layanan yang dikelola SINUX dirawat menurut jadwal PM tahunan di SNX-OPS-FRM-07, sheet Jadwal PM. Aktivitas minimal dan frekuensinya ada di bagian 8 (ISO 9001 7.1.3; Annex A 7.13).</w:t>
+        <w:t xml:space="preserve">Infrastruktur dan layanan yang dikelola SINUX dirawat menurut jadwal PM tahunan di SNX-OPS-FRM-07, sheet Jadwal PM, dengan aktivitas dan frekuensi minimal sesuai tabel bagian 8 (ISO 9001 7.1.3; Annex A 7.13).</w:t>
       </w:r>
     </w:p>
     <w:p>
@@ -3383,7 +3477,7 @@
           <w:sz w:val="24"/>
           <w:szCs w:val="24"/>
         </w:rPr>
-        <w:t xml:space="preserve">PM yang menyentuh kontrol keamanan butuh persetujuan Lead SOC.</w:t>
+        <w:t xml:space="preserve">PM yang menyentuh kontrol keamanan memerlukan persetujuan Lead SOC.</w:t>
       </w:r>
     </w:p>
     <w:p>
@@ -3431,7 +3525,7 @@
           <w:sz w:val="24"/>
           <w:szCs w:val="24"/>
         </w:rPr>
-        <w:t xml:space="preserve">Kerusakan, penurunan kinerja, dan temuan PM yang tidak selesai saat PM ditangani sebagai CM dan dicatat sebagai tiket (ISO 9001 10.2).</w:t>
+        <w:t xml:space="preserve">Kerusakan, penurunan kinerja, dan temuan PM yang tidak selesai saat PM ditangani sebagai CM dan dicatat sebagai ticket (ISO 9001 10.2).</w:t>
       </w:r>
     </w:p>
     <w:p>
@@ -3455,12 +3549,13 @@
           <w:sz w:val="24"/>
           <w:szCs w:val="24"/>
         </w:rPr>
-        <w:t xml:space="preserve">Temuan berulang pada aset yang sama dievaluasi sebagai problem dan dapat memicu RCA di SNX-OPS-FRM-10 (ISO 9001 10.2). Temuan dihitung berulang bila terjadi tiga kali atau lebih pada aset yang sama dalam 30 hari, sama dengan ambang insiden berulang di SNX-OPS-SOP-04 (USULAN).</w:t>
+        <w:t xml:space="preserve">Temuan berulang pada aset yang sama dievaluasi sebagai problem dan dapat memicu RCA di SNX-OPS-FRM-10 (ISO 9001 10.2). Temuan dihitung berulang jika terjadi tiga kali atau lebih pada aset yang sama dalam 30 hari, sama dengan ambang insiden berulang di SNX-OPS-SOP-04 (USULAN).</w:t>
       </w:r>
     </w:p>
     <w:p>
       <w:pPr>
         <w:pStyle w:val="Heading1"/>
+        <w:keepNext/>
         <w:numPr>
           <w:ilvl w:val="0"/>
           <w:numId w:val="7"/>
@@ -3488,6 +3583,8 @@
       </w:tblGrid>
       <w:tr>
         <w:trPr>
+          <w:cantSplit/>
+          <w:tblHeader/>
           <w:jc w:val="center"/>
         </w:trPr>
         <w:tc>
@@ -3504,6 +3601,7 @@
           </w:tcPr>
           <w:p>
             <w:pPr>
+              <w:keepNext/>
               <w:jc w:val="center"/>
               <w:rPr>
                 <w:sz w:val="24"/>
@@ -3535,6 +3633,7 @@
           </w:tcPr>
           <w:p>
             <w:pPr>
+              <w:keepNext/>
               <w:jc w:val="center"/>
               <w:rPr>
                 <w:sz w:val="24"/>
@@ -3566,6 +3665,7 @@
           </w:tcPr>
           <w:p>
             <w:pPr>
+              <w:keepNext/>
               <w:jc w:val="center"/>
               <w:rPr>
                 <w:sz w:val="24"/>
@@ -3586,6 +3686,7 @@
       </w:tr>
       <w:tr>
         <w:trPr>
+          <w:cantSplit/>
           <w:jc w:val="center"/>
         </w:trPr>
         <w:tc>
@@ -3631,7 +3732,7 @@
           </w:tcPr>
           <w:p>
             <w:pPr>
-              <w:jc w:val="both"/>
+              <w:jc w:val="left"/>
               <w:rPr>
                 <w:sz w:val="24"/>
                 <w:szCs w:val="24"/>
@@ -3661,7 +3762,7 @@
           </w:tcPr>
           <w:p>
             <w:pPr>
-              <w:jc w:val="both"/>
+              <w:jc w:val="left"/>
               <w:rPr>
                 <w:sz w:val="24"/>
                 <w:szCs w:val="24"/>
@@ -3680,6 +3781,7 @@
       </w:tr>
       <w:tr>
         <w:trPr>
+          <w:cantSplit/>
           <w:jc w:val="center"/>
         </w:trPr>
         <w:tc>
@@ -3725,19 +3827,19 @@
           </w:tcPr>
           <w:p>
             <w:pPr>
-              <w:jc w:val="both"/>
-              <w:rPr>
-                <w:sz w:val="24"/>
-                <w:szCs w:val="24"/>
-              </w:rPr>
-            </w:pPr>
-            <w:r>
-              <w:rPr>
-                <w:b w:val="0"/>
-                <w:sz w:val="24"/>
-                <w:szCs w:val="24"/>
-              </w:rPr>
-              <w:t>Melaksanakan PM dan CM; mencatat tiket CM; mengisi service report.</w:t>
+              <w:jc w:val="left"/>
+              <w:rPr>
+                <w:sz w:val="24"/>
+                <w:szCs w:val="24"/>
+              </w:rPr>
+            </w:pPr>
+            <w:r>
+              <w:rPr>
+                <w:b w:val="0"/>
+                <w:sz w:val="24"/>
+                <w:szCs w:val="24"/>
+              </w:rPr>
+              <w:t>Melaksanakan PM dan CM; mencatat ticket CM; mengisi service report.</w:t>
             </w:r>
           </w:p>
         </w:tc>
@@ -3755,7 +3857,7 @@
           </w:tcPr>
           <w:p>
             <w:pPr>
-              <w:jc w:val="both"/>
+              <w:jc w:val="left"/>
               <w:rPr>
                 <w:sz w:val="24"/>
                 <w:szCs w:val="24"/>
@@ -3774,6 +3876,7 @@
       </w:tr>
       <w:tr>
         <w:trPr>
+          <w:cantSplit/>
           <w:jc w:val="center"/>
         </w:trPr>
         <w:tc>
@@ -3819,19 +3922,19 @@
           </w:tcPr>
           <w:p>
             <w:pPr>
-              <w:jc w:val="both"/>
-              <w:rPr>
-                <w:sz w:val="24"/>
-                <w:szCs w:val="24"/>
-              </w:rPr>
-            </w:pPr>
-            <w:r>
-              <w:rPr>
-                <w:b w:val="0"/>
-                <w:sz w:val="24"/>
-                <w:szCs w:val="24"/>
-              </w:rPr>
-              <w:t>Menyetujui PM yang menyentuh kontrol keamanan; menyuplai daftar patch keamanan; mereview rule firewall, WAF, dan akun tidak terpakai tiap triwulan.</w:t>
+              <w:jc w:val="left"/>
+              <w:rPr>
+                <w:sz w:val="24"/>
+                <w:szCs w:val="24"/>
+              </w:rPr>
+            </w:pPr>
+            <w:r>
+              <w:rPr>
+                <w:b w:val="0"/>
+                <w:sz w:val="24"/>
+                <w:szCs w:val="24"/>
+              </w:rPr>
+              <w:t>Menyetujui PM yang menyentuh kontrol keamanan; menyediakan daftar patch keamanan; melakukan review rule firewall, WAF, dan akun tidak terpakai tiap triwulan.</w:t>
             </w:r>
           </w:p>
         </w:tc>
@@ -3849,7 +3952,7 @@
           </w:tcPr>
           <w:p>
             <w:pPr>
-              <w:jc w:val="both"/>
+              <w:jc w:val="left"/>
               <w:rPr>
                 <w:sz w:val="24"/>
                 <w:szCs w:val="24"/>
@@ -3868,6 +3971,7 @@
       </w:tr>
       <w:tr>
         <w:trPr>
+          <w:cantSplit/>
           <w:jc w:val="center"/>
         </w:trPr>
         <w:tc>
@@ -3913,7 +4017,7 @@
           </w:tcPr>
           <w:p>
             <w:pPr>
-              <w:jc w:val="both"/>
+              <w:jc w:val="left"/>
               <w:rPr>
                 <w:sz w:val="24"/>
                 <w:szCs w:val="24"/>
@@ -3943,7 +4047,7 @@
           </w:tcPr>
           <w:p>
             <w:pPr>
-              <w:jc w:val="both"/>
+              <w:jc w:val="left"/>
               <w:rPr>
                 <w:sz w:val="24"/>
                 <w:szCs w:val="24"/>
@@ -3962,6 +4066,7 @@
       </w:tr>
       <w:tr>
         <w:trPr>
+          <w:cantSplit/>
           <w:jc w:val="center"/>
         </w:trPr>
         <w:tc>
@@ -4007,7 +4112,7 @@
           </w:tcPr>
           <w:p>
             <w:pPr>
-              <w:jc w:val="both"/>
+              <w:jc w:val="left"/>
               <w:rPr>
                 <w:sz w:val="24"/>
                 <w:szCs w:val="24"/>
@@ -4037,7 +4142,7 @@
           </w:tcPr>
           <w:p>
             <w:pPr>
-              <w:jc w:val="both"/>
+              <w:jc w:val="left"/>
               <w:rPr>
                 <w:sz w:val="24"/>
                 <w:szCs w:val="24"/>
@@ -4056,6 +4161,7 @@
       </w:tr>
       <w:tr>
         <w:trPr>
+          <w:cantSplit/>
           <w:jc w:val="center"/>
         </w:trPr>
         <w:tc>
@@ -4101,7 +4207,7 @@
           </w:tcPr>
           <w:p>
             <w:pPr>
-              <w:jc w:val="both"/>
+              <w:jc w:val="left"/>
               <w:rPr>
                 <w:sz w:val="24"/>
                 <w:szCs w:val="24"/>
@@ -4131,7 +4237,7 @@
           </w:tcPr>
           <w:p>
             <w:pPr>
-              <w:jc w:val="both"/>
+              <w:jc w:val="left"/>
               <w:rPr>
                 <w:sz w:val="24"/>
                 <w:szCs w:val="24"/>
@@ -4183,6 +4289,7 @@
     <w:p>
       <w:pPr>
         <w:pStyle w:val="Heading2"/>
+        <w:keepNext/>
         <w:numPr>
           <w:ilvl w:val="1"/>
           <w:numId w:val="7"/>
@@ -4205,27 +4312,30 @@
         <w:tblLook w:val="0400" w:firstRow="0" w:lastRow="0" w:firstColumn="0" w:lastColumn="0" w:noHBand="0" w:noVBand="1"/>
       </w:tblPr>
       <w:tblGrid>
-        <w:gridCol w:w="3367"/>
-        <w:gridCol w:w="2248"/>
-        <w:gridCol w:w="3913"/>
+        <w:gridCol w:w="4309"/>
+        <w:gridCol w:w="1927"/>
+        <w:gridCol w:w="2835"/>
       </w:tblGrid>
       <w:tr>
         <w:trPr>
+          <w:cantSplit/>
+          <w:tblHeader/>
           <w:jc w:val="center"/>
         </w:trPr>
         <w:tc>
           <w:tcPr>
-            <w:tcW w:w="3367" w:type="dxa"/>
-            <w:tcBorders>
-              <w:top w:val="single" w:sz="8" w:space="0" w:color="000000"/>
-              <w:left w:val="single" w:sz="8" w:space="0" w:color="000000"/>
-              <w:bottom w:val="single" w:sz="8" w:space="0" w:color="000000"/>
-              <w:right w:val="single" w:sz="8" w:space="0" w:color="000000"/>
-            </w:tcBorders>
-            <w:vAlign w:val="center"/>
-          </w:tcPr>
-          <w:p>
-            <w:pPr>
+            <w:tcW w:w="4309" w:type="dxa"/>
+            <w:tcBorders>
+              <w:top w:val="single" w:sz="8" w:space="0" w:color="000000"/>
+              <w:left w:val="single" w:sz="8" w:space="0" w:color="000000"/>
+              <w:bottom w:val="single" w:sz="8" w:space="0" w:color="000000"/>
+              <w:right w:val="single" w:sz="8" w:space="0" w:color="000000"/>
+            </w:tcBorders>
+            <w:vAlign w:val="center"/>
+          </w:tcPr>
+          <w:p>
+            <w:pPr>
+              <w:keepNext/>
               <w:jc w:val="center"/>
               <w:rPr>
                 <w:sz w:val="24"/>
@@ -4245,17 +4355,18 @@
         </w:tc>
         <w:tc>
           <w:tcPr>
-            <w:tcW w:w="2248" w:type="dxa"/>
-            <w:tcBorders>
-              <w:top w:val="single" w:sz="8" w:space="0" w:color="000000"/>
-              <w:left w:val="single" w:sz="8" w:space="0" w:color="000000"/>
-              <w:bottom w:val="single" w:sz="8" w:space="0" w:color="000000"/>
-              <w:right w:val="single" w:sz="8" w:space="0" w:color="000000"/>
-            </w:tcBorders>
-            <w:vAlign w:val="center"/>
-          </w:tcPr>
-          <w:p>
-            <w:pPr>
+            <w:tcW w:w="1927" w:type="dxa"/>
+            <w:tcBorders>
+              <w:top w:val="single" w:sz="8" w:space="0" w:color="000000"/>
+              <w:left w:val="single" w:sz="8" w:space="0" w:color="000000"/>
+              <w:bottom w:val="single" w:sz="8" w:space="0" w:color="000000"/>
+              <w:right w:val="single" w:sz="8" w:space="0" w:color="000000"/>
+            </w:tcBorders>
+            <w:vAlign w:val="center"/>
+          </w:tcPr>
+          <w:p>
+            <w:pPr>
+              <w:keepNext/>
               <w:jc w:val="center"/>
               <w:rPr>
                 <w:sz w:val="24"/>
@@ -4275,17 +4386,18 @@
         </w:tc>
         <w:tc>
           <w:tcPr>
-            <w:tcW w:w="3913" w:type="dxa"/>
-            <w:tcBorders>
-              <w:top w:val="single" w:sz="8" w:space="0" w:color="000000"/>
-              <w:left w:val="single" w:sz="8" w:space="0" w:color="000000"/>
-              <w:bottom w:val="single" w:sz="8" w:space="0" w:color="000000"/>
-              <w:right w:val="single" w:sz="8" w:space="0" w:color="000000"/>
-            </w:tcBorders>
-            <w:vAlign w:val="center"/>
-          </w:tcPr>
-          <w:p>
-            <w:pPr>
+            <w:tcW w:w="2835" w:type="dxa"/>
+            <w:tcBorders>
+              <w:top w:val="single" w:sz="8" w:space="0" w:color="000000"/>
+              <w:left w:val="single" w:sz="8" w:space="0" w:color="000000"/>
+              <w:bottom w:val="single" w:sz="8" w:space="0" w:color="000000"/>
+              <w:right w:val="single" w:sz="8" w:space="0" w:color="000000"/>
+            </w:tcBorders>
+            <w:vAlign w:val="center"/>
+          </w:tcPr>
+          <w:p>
+            <w:pPr>
+              <w:keepNext/>
               <w:jc w:val="center"/>
               <w:rPr>
                 <w:sz w:val="24"/>
@@ -4306,11 +4418,12 @@
       </w:tr>
       <w:tr>
         <w:trPr>
+          <w:cantSplit/>
           <w:jc w:val="center"/>
         </w:trPr>
         <w:tc>
           <w:tcPr>
-            <w:tcW w:w="3367" w:type="dxa"/>
+            <w:tcW w:w="4309" w:type="dxa"/>
             <w:tcBorders>
               <w:top w:val="single" w:sz="8" w:space="0" w:color="000000"/>
               <w:left w:val="single" w:sz="8" w:space="0" w:color="000000"/>
@@ -4338,7 +4451,7 @@
         </w:tc>
         <w:tc>
           <w:tcPr>
-            <w:tcW w:w="2248" w:type="dxa"/>
+            <w:tcW w:w="1927" w:type="dxa"/>
             <w:tcBorders>
               <w:top w:val="single" w:sz="8" w:space="0" w:color="000000"/>
               <w:left w:val="single" w:sz="8" w:space="0" w:color="000000"/>
@@ -4366,18 +4479,18 @@
         </w:tc>
         <w:tc>
           <w:tcPr>
-            <w:tcW w:w="3913" w:type="dxa"/>
-            <w:tcBorders>
-              <w:top w:val="single" w:sz="8" w:space="0" w:color="000000"/>
-              <w:left w:val="single" w:sz="8" w:space="0" w:color="000000"/>
-              <w:bottom w:val="single" w:sz="8" w:space="0" w:color="000000"/>
-              <w:right w:val="single" w:sz="8" w:space="0" w:color="000000"/>
-            </w:tcBorders>
-            <w:vAlign w:val="center"/>
-          </w:tcPr>
-          <w:p>
-            <w:pPr>
-              <w:jc w:val="both"/>
+            <w:tcW w:w="2835" w:type="dxa"/>
+            <w:tcBorders>
+              <w:top w:val="single" w:sz="8" w:space="0" w:color="000000"/>
+              <w:left w:val="single" w:sz="8" w:space="0" w:color="000000"/>
+              <w:bottom w:val="single" w:sz="8" w:space="0" w:color="000000"/>
+              <w:right w:val="single" w:sz="8" w:space="0" w:color="000000"/>
+            </w:tcBorders>
+            <w:vAlign w:val="center"/>
+          </w:tcPr>
+          <w:p>
+            <w:pPr>
+              <w:jc w:val="left"/>
               <w:rPr>
                 <w:sz w:val="24"/>
                 <w:szCs w:val="24"/>
@@ -4396,39 +4509,40 @@
       </w:tr>
       <w:tr>
         <w:trPr>
+          <w:cantSplit/>
           <w:jc w:val="center"/>
         </w:trPr>
         <w:tc>
           <w:tcPr>
-            <w:tcW w:w="3367" w:type="dxa"/>
-            <w:tcBorders>
-              <w:top w:val="single" w:sz="8" w:space="0" w:color="000000"/>
-              <w:left w:val="single" w:sz="8" w:space="0" w:color="000000"/>
-              <w:bottom w:val="single" w:sz="8" w:space="0" w:color="000000"/>
-              <w:right w:val="single" w:sz="8" w:space="0" w:color="000000"/>
-            </w:tcBorders>
-            <w:vAlign w:val="center"/>
-          </w:tcPr>
-          <w:p>
-            <w:pPr>
-              <w:rPr>
-                <w:sz w:val="24"/>
-                <w:szCs w:val="24"/>
-              </w:rPr>
-            </w:pPr>
-            <w:r>
-              <w:rPr>
-                <w:b w:val="0"/>
-                <w:sz w:val="24"/>
-                <w:szCs w:val="24"/>
-              </w:rPr>
-              <w:t>2. Cantumkan di jadwal PM aktivitas minimal dan frekuensi minimalnya sesuai tabel SLA (bagian 8), beserta PIC tiap aktivitas.</w:t>
-            </w:r>
-          </w:p>
-        </w:tc>
-        <w:tc>
-          <w:tcPr>
-            <w:tcW w:w="2248" w:type="dxa"/>
+            <w:tcW w:w="4309" w:type="dxa"/>
+            <w:tcBorders>
+              <w:top w:val="single" w:sz="8" w:space="0" w:color="000000"/>
+              <w:left w:val="single" w:sz="8" w:space="0" w:color="000000"/>
+              <w:bottom w:val="single" w:sz="8" w:space="0" w:color="000000"/>
+              <w:right w:val="single" w:sz="8" w:space="0" w:color="000000"/>
+            </w:tcBorders>
+            <w:vAlign w:val="center"/>
+          </w:tcPr>
+          <w:p>
+            <w:pPr>
+              <w:rPr>
+                <w:sz w:val="24"/>
+                <w:szCs w:val="24"/>
+              </w:rPr>
+            </w:pPr>
+            <w:r>
+              <w:rPr>
+                <w:b w:val="0"/>
+                <w:sz w:val="24"/>
+                <w:szCs w:val="24"/>
+              </w:rPr>
+              <w:t>2. Cantumkan aktivitas minimal, frekuensi minimal, dan PIC tiap aktivitas di jadwal PM sesuai tabel SLA (bagian 8).</w:t>
+            </w:r>
+          </w:p>
+        </w:tc>
+        <w:tc>
+          <w:tcPr>
+            <w:tcW w:w="1927" w:type="dxa"/>
             <w:tcBorders>
               <w:top w:val="single" w:sz="8" w:space="0" w:color="000000"/>
               <w:left w:val="single" w:sz="8" w:space="0" w:color="000000"/>
@@ -4456,18 +4570,18 @@
         </w:tc>
         <w:tc>
           <w:tcPr>
-            <w:tcW w:w="3913" w:type="dxa"/>
-            <w:tcBorders>
-              <w:top w:val="single" w:sz="8" w:space="0" w:color="000000"/>
-              <w:left w:val="single" w:sz="8" w:space="0" w:color="000000"/>
-              <w:bottom w:val="single" w:sz="8" w:space="0" w:color="000000"/>
-              <w:right w:val="single" w:sz="8" w:space="0" w:color="000000"/>
-            </w:tcBorders>
-            <w:vAlign w:val="center"/>
-          </w:tcPr>
-          <w:p>
-            <w:pPr>
-              <w:jc w:val="both"/>
+            <w:tcW w:w="2835" w:type="dxa"/>
+            <w:tcBorders>
+              <w:top w:val="single" w:sz="8" w:space="0" w:color="000000"/>
+              <w:left w:val="single" w:sz="8" w:space="0" w:color="000000"/>
+              <w:bottom w:val="single" w:sz="8" w:space="0" w:color="000000"/>
+              <w:right w:val="single" w:sz="8" w:space="0" w:color="000000"/>
+            </w:tcBorders>
+            <w:vAlign w:val="center"/>
+          </w:tcPr>
+          <w:p>
+            <w:pPr>
+              <w:jc w:val="left"/>
               <w:rPr>
                 <w:sz w:val="24"/>
                 <w:szCs w:val="24"/>
@@ -4486,11 +4600,12 @@
       </w:tr>
       <w:tr>
         <w:trPr>
+          <w:cantSplit/>
           <w:jc w:val="center"/>
         </w:trPr>
         <w:tc>
           <w:tcPr>
-            <w:tcW w:w="3367" w:type="dxa"/>
+            <w:tcW w:w="4309" w:type="dxa"/>
             <w:tcBorders>
               <w:top w:val="single" w:sz="8" w:space="0" w:color="000000"/>
               <w:left w:val="single" w:sz="8" w:space="0" w:color="000000"/>
@@ -4518,7 +4633,7 @@
         </w:tc>
         <w:tc>
           <w:tcPr>
-            <w:tcW w:w="2248" w:type="dxa"/>
+            <w:tcW w:w="1927" w:type="dxa"/>
             <w:tcBorders>
               <w:top w:val="single" w:sz="8" w:space="0" w:color="000000"/>
               <w:left w:val="single" w:sz="8" w:space="0" w:color="000000"/>
@@ -4546,18 +4661,18 @@
         </w:tc>
         <w:tc>
           <w:tcPr>
-            <w:tcW w:w="3913" w:type="dxa"/>
-            <w:tcBorders>
-              <w:top w:val="single" w:sz="8" w:space="0" w:color="000000"/>
-              <w:left w:val="single" w:sz="8" w:space="0" w:color="000000"/>
-              <w:bottom w:val="single" w:sz="8" w:space="0" w:color="000000"/>
-              <w:right w:val="single" w:sz="8" w:space="0" w:color="000000"/>
-            </w:tcBorders>
-            <w:vAlign w:val="center"/>
-          </w:tcPr>
-          <w:p>
-            <w:pPr>
-              <w:jc w:val="both"/>
+            <w:tcW w:w="2835" w:type="dxa"/>
+            <w:tcBorders>
+              <w:top w:val="single" w:sz="8" w:space="0" w:color="000000"/>
+              <w:left w:val="single" w:sz="8" w:space="0" w:color="000000"/>
+              <w:bottom w:val="single" w:sz="8" w:space="0" w:color="000000"/>
+              <w:right w:val="single" w:sz="8" w:space="0" w:color="000000"/>
+            </w:tcBorders>
+            <w:vAlign w:val="center"/>
+          </w:tcPr>
+          <w:p>
+            <w:pPr>
+              <w:jc w:val="left"/>
               <w:rPr>
                 <w:sz w:val="24"/>
                 <w:szCs w:val="24"/>
@@ -4602,6 +4717,7 @@
     <w:p>
       <w:pPr>
         <w:pStyle w:val="Heading2"/>
+        <w:keepNext/>
         <w:numPr>
           <w:ilvl w:val="1"/>
           <w:numId w:val="7"/>
@@ -4622,27 +4738,30 @@
         <w:tblLook w:val="0400" w:firstRow="0" w:lastRow="0" w:firstColumn="0" w:lastColumn="0" w:noHBand="0" w:noVBand="1"/>
       </w:tblPr>
       <w:tblGrid>
-        <w:gridCol w:w="3367"/>
-        <w:gridCol w:w="2248"/>
-        <w:gridCol w:w="3913"/>
+        <w:gridCol w:w="4309"/>
+        <w:gridCol w:w="1927"/>
+        <w:gridCol w:w="2835"/>
       </w:tblGrid>
       <w:tr>
         <w:trPr>
+          <w:cantSplit/>
+          <w:tblHeader/>
           <w:jc w:val="center"/>
         </w:trPr>
         <w:tc>
           <w:tcPr>
-            <w:tcW w:w="3367" w:type="dxa"/>
-            <w:tcBorders>
-              <w:top w:val="single" w:sz="8" w:space="0" w:color="000000"/>
-              <w:left w:val="single" w:sz="8" w:space="0" w:color="000000"/>
-              <w:bottom w:val="single" w:sz="8" w:space="0" w:color="000000"/>
-              <w:right w:val="single" w:sz="8" w:space="0" w:color="000000"/>
-            </w:tcBorders>
-            <w:vAlign w:val="center"/>
-          </w:tcPr>
-          <w:p>
-            <w:pPr>
+            <w:tcW w:w="4309" w:type="dxa"/>
+            <w:tcBorders>
+              <w:top w:val="single" w:sz="8" w:space="0" w:color="000000"/>
+              <w:left w:val="single" w:sz="8" w:space="0" w:color="000000"/>
+              <w:bottom w:val="single" w:sz="8" w:space="0" w:color="000000"/>
+              <w:right w:val="single" w:sz="8" w:space="0" w:color="000000"/>
+            </w:tcBorders>
+            <w:vAlign w:val="center"/>
+          </w:tcPr>
+          <w:p>
+            <w:pPr>
+              <w:keepNext/>
               <w:jc w:val="center"/>
               <w:rPr>
                 <w:sz w:val="24"/>
@@ -4662,17 +4781,18 @@
         </w:tc>
         <w:tc>
           <w:tcPr>
-            <w:tcW w:w="2248" w:type="dxa"/>
-            <w:tcBorders>
-              <w:top w:val="single" w:sz="8" w:space="0" w:color="000000"/>
-              <w:left w:val="single" w:sz="8" w:space="0" w:color="000000"/>
-              <w:bottom w:val="single" w:sz="8" w:space="0" w:color="000000"/>
-              <w:right w:val="single" w:sz="8" w:space="0" w:color="000000"/>
-            </w:tcBorders>
-            <w:vAlign w:val="center"/>
-          </w:tcPr>
-          <w:p>
-            <w:pPr>
+            <w:tcW w:w="1927" w:type="dxa"/>
+            <w:tcBorders>
+              <w:top w:val="single" w:sz="8" w:space="0" w:color="000000"/>
+              <w:left w:val="single" w:sz="8" w:space="0" w:color="000000"/>
+              <w:bottom w:val="single" w:sz="8" w:space="0" w:color="000000"/>
+              <w:right w:val="single" w:sz="8" w:space="0" w:color="000000"/>
+            </w:tcBorders>
+            <w:vAlign w:val="center"/>
+          </w:tcPr>
+          <w:p>
+            <w:pPr>
+              <w:keepNext/>
               <w:jc w:val="center"/>
               <w:rPr>
                 <w:sz w:val="24"/>
@@ -4692,17 +4812,18 @@
         </w:tc>
         <w:tc>
           <w:tcPr>
-            <w:tcW w:w="3913" w:type="dxa"/>
-            <w:tcBorders>
-              <w:top w:val="single" w:sz="8" w:space="0" w:color="000000"/>
-              <w:left w:val="single" w:sz="8" w:space="0" w:color="000000"/>
-              <w:bottom w:val="single" w:sz="8" w:space="0" w:color="000000"/>
-              <w:right w:val="single" w:sz="8" w:space="0" w:color="000000"/>
-            </w:tcBorders>
-            <w:vAlign w:val="center"/>
-          </w:tcPr>
-          <w:p>
-            <w:pPr>
+            <w:tcW w:w="2835" w:type="dxa"/>
+            <w:tcBorders>
+              <w:top w:val="single" w:sz="8" w:space="0" w:color="000000"/>
+              <w:left w:val="single" w:sz="8" w:space="0" w:color="000000"/>
+              <w:bottom w:val="single" w:sz="8" w:space="0" w:color="000000"/>
+              <w:right w:val="single" w:sz="8" w:space="0" w:color="000000"/>
+            </w:tcBorders>
+            <w:vAlign w:val="center"/>
+          </w:tcPr>
+          <w:p>
+            <w:pPr>
+              <w:keepNext/>
               <w:jc w:val="center"/>
               <w:rPr>
                 <w:sz w:val="24"/>
@@ -4723,11 +4844,12 @@
       </w:tr>
       <w:tr>
         <w:trPr>
+          <w:cantSplit/>
           <w:jc w:val="center"/>
         </w:trPr>
         <w:tc>
           <w:tcPr>
-            <w:tcW w:w="3367" w:type="dxa"/>
+            <w:tcW w:w="4309" w:type="dxa"/>
             <w:tcBorders>
               <w:top w:val="single" w:sz="8" w:space="0" w:color="000000"/>
               <w:left w:val="single" w:sz="8" w:space="0" w:color="000000"/>
@@ -4755,7 +4877,7 @@
         </w:tc>
         <w:tc>
           <w:tcPr>
-            <w:tcW w:w="2248" w:type="dxa"/>
+            <w:tcW w:w="1927" w:type="dxa"/>
             <w:tcBorders>
               <w:top w:val="single" w:sz="8" w:space="0" w:color="000000"/>
               <w:left w:val="single" w:sz="8" w:space="0" w:color="000000"/>
@@ -4783,18 +4905,18 @@
         </w:tc>
         <w:tc>
           <w:tcPr>
-            <w:tcW w:w="3913" w:type="dxa"/>
-            <w:tcBorders>
-              <w:top w:val="single" w:sz="8" w:space="0" w:color="000000"/>
-              <w:left w:val="single" w:sz="8" w:space="0" w:color="000000"/>
-              <w:bottom w:val="single" w:sz="8" w:space="0" w:color="000000"/>
-              <w:right w:val="single" w:sz="8" w:space="0" w:color="000000"/>
-            </w:tcBorders>
-            <w:vAlign w:val="center"/>
-          </w:tcPr>
-          <w:p>
-            <w:pPr>
-              <w:jc w:val="both"/>
+            <w:tcW w:w="2835" w:type="dxa"/>
+            <w:tcBorders>
+              <w:top w:val="single" w:sz="8" w:space="0" w:color="000000"/>
+              <w:left w:val="single" w:sz="8" w:space="0" w:color="000000"/>
+              <w:bottom w:val="single" w:sz="8" w:space="0" w:color="000000"/>
+              <w:right w:val="single" w:sz="8" w:space="0" w:color="000000"/>
+            </w:tcBorders>
+            <w:vAlign w:val="center"/>
+          </w:tcPr>
+          <w:p>
+            <w:pPr>
+              <w:jc w:val="left"/>
               <w:rPr>
                 <w:sz w:val="24"/>
                 <w:szCs w:val="24"/>
@@ -4813,39 +4935,40 @@
       </w:tr>
       <w:tr>
         <w:trPr>
+          <w:cantSplit/>
           <w:jc w:val="center"/>
         </w:trPr>
         <w:tc>
           <w:tcPr>
-            <w:tcW w:w="3367" w:type="dxa"/>
-            <w:tcBorders>
-              <w:top w:val="single" w:sz="8" w:space="0" w:color="000000"/>
-              <w:left w:val="single" w:sz="8" w:space="0" w:color="000000"/>
-              <w:bottom w:val="single" w:sz="8" w:space="0" w:color="000000"/>
-              <w:right w:val="single" w:sz="8" w:space="0" w:color="000000"/>
-            </w:tcBorders>
-            <w:vAlign w:val="center"/>
-          </w:tcPr>
-          <w:p>
-            <w:pPr>
-              <w:rPr>
-                <w:sz w:val="24"/>
-                <w:szCs w:val="24"/>
-              </w:rPr>
-            </w:pPr>
-            <w:r>
-              <w:rPr>
-                <w:b w:val="0"/>
-                <w:sz w:val="24"/>
-                <w:szCs w:val="24"/>
-              </w:rPr>
-              <w:t>2. Suplai daftar patch keamanan untuk PM patch dan update OS.</w:t>
-            </w:r>
-          </w:p>
-        </w:tc>
-        <w:tc>
-          <w:tcPr>
-            <w:tcW w:w="2248" w:type="dxa"/>
+            <w:tcW w:w="4309" w:type="dxa"/>
+            <w:tcBorders>
+              <w:top w:val="single" w:sz="8" w:space="0" w:color="000000"/>
+              <w:left w:val="single" w:sz="8" w:space="0" w:color="000000"/>
+              <w:bottom w:val="single" w:sz="8" w:space="0" w:color="000000"/>
+              <w:right w:val="single" w:sz="8" w:space="0" w:color="000000"/>
+            </w:tcBorders>
+            <w:vAlign w:val="center"/>
+          </w:tcPr>
+          <w:p>
+            <w:pPr>
+              <w:rPr>
+                <w:sz w:val="24"/>
+                <w:szCs w:val="24"/>
+              </w:rPr>
+            </w:pPr>
+            <w:r>
+              <w:rPr>
+                <w:b w:val="0"/>
+                <w:sz w:val="24"/>
+                <w:szCs w:val="24"/>
+              </w:rPr>
+              <w:t>2. Sediakan daftar patch keamanan untuk PM patch dan update OS.</w:t>
+            </w:r>
+          </w:p>
+        </w:tc>
+        <w:tc>
+          <w:tcPr>
+            <w:tcW w:w="1927" w:type="dxa"/>
             <w:tcBorders>
               <w:top w:val="single" w:sz="8" w:space="0" w:color="000000"/>
               <w:left w:val="single" w:sz="8" w:space="0" w:color="000000"/>
@@ -4873,18 +4996,18 @@
         </w:tc>
         <w:tc>
           <w:tcPr>
-            <w:tcW w:w="3913" w:type="dxa"/>
-            <w:tcBorders>
-              <w:top w:val="single" w:sz="8" w:space="0" w:color="000000"/>
-              <w:left w:val="single" w:sz="8" w:space="0" w:color="000000"/>
-              <w:bottom w:val="single" w:sz="8" w:space="0" w:color="000000"/>
-              <w:right w:val="single" w:sz="8" w:space="0" w:color="000000"/>
-            </w:tcBorders>
-            <w:vAlign w:val="center"/>
-          </w:tcPr>
-          <w:p>
-            <w:pPr>
-              <w:jc w:val="both"/>
+            <w:tcW w:w="2835" w:type="dxa"/>
+            <w:tcBorders>
+              <w:top w:val="single" w:sz="8" w:space="0" w:color="000000"/>
+              <w:left w:val="single" w:sz="8" w:space="0" w:color="000000"/>
+              <w:bottom w:val="single" w:sz="8" w:space="0" w:color="000000"/>
+              <w:right w:val="single" w:sz="8" w:space="0" w:color="000000"/>
+            </w:tcBorders>
+            <w:vAlign w:val="center"/>
+          </w:tcPr>
+          <w:p>
+            <w:pPr>
+              <w:jc w:val="left"/>
               <w:rPr>
                 <w:sz w:val="24"/>
                 <w:szCs w:val="24"/>
@@ -4903,39 +5026,40 @@
       </w:tr>
       <w:tr>
         <w:trPr>
+          <w:cantSplit/>
           <w:jc w:val="center"/>
         </w:trPr>
         <w:tc>
           <w:tcPr>
-            <w:tcW w:w="3367" w:type="dxa"/>
-            <w:tcBorders>
-              <w:top w:val="single" w:sz="8" w:space="0" w:color="000000"/>
-              <w:left w:val="single" w:sz="8" w:space="0" w:color="000000"/>
-              <w:bottom w:val="single" w:sz="8" w:space="0" w:color="000000"/>
-              <w:right w:val="single" w:sz="8" w:space="0" w:color="000000"/>
-            </w:tcBorders>
-            <w:vAlign w:val="center"/>
-          </w:tcPr>
-          <w:p>
-            <w:pPr>
-              <w:rPr>
-                <w:sz w:val="24"/>
-                <w:szCs w:val="24"/>
-              </w:rPr>
-            </w:pPr>
-            <w:r>
-              <w:rPr>
-                <w:b w:val="0"/>
-                <w:sz w:val="24"/>
-                <w:szCs w:val="24"/>
-              </w:rPr>
-              <w:t>3. Ajukan change request untuk PM yang mengubah sistem sesuai SNX-OPS-SOP-02; change Normal diajukan minimal 3 hari kerja sebelum window maintenance.</w:t>
-            </w:r>
-          </w:p>
-        </w:tc>
-        <w:tc>
-          <w:tcPr>
-            <w:tcW w:w="2248" w:type="dxa"/>
+            <w:tcW w:w="4309" w:type="dxa"/>
+            <w:tcBorders>
+              <w:top w:val="single" w:sz="8" w:space="0" w:color="000000"/>
+              <w:left w:val="single" w:sz="8" w:space="0" w:color="000000"/>
+              <w:bottom w:val="single" w:sz="8" w:space="0" w:color="000000"/>
+              <w:right w:val="single" w:sz="8" w:space="0" w:color="000000"/>
+            </w:tcBorders>
+            <w:vAlign w:val="center"/>
+          </w:tcPr>
+          <w:p>
+            <w:pPr>
+              <w:rPr>
+                <w:sz w:val="24"/>
+                <w:szCs w:val="24"/>
+              </w:rPr>
+            </w:pPr>
+            <w:r>
+              <w:rPr>
+                <w:b w:val="0"/>
+                <w:sz w:val="24"/>
+                <w:szCs w:val="24"/>
+              </w:rPr>
+              <w:t>3. Ajukan change request untuk PM yang mengubah sistem sesuai SNX-OPS-SOP-02. Change Normal diajukan minimal 3 hari kerja sebelum window maintenance.</w:t>
+            </w:r>
+          </w:p>
+        </w:tc>
+        <w:tc>
+          <w:tcPr>
+            <w:tcW w:w="1927" w:type="dxa"/>
             <w:tcBorders>
               <w:top w:val="single" w:sz="8" w:space="0" w:color="000000"/>
               <w:left w:val="single" w:sz="8" w:space="0" w:color="000000"/>
@@ -4963,18 +5087,18 @@
         </w:tc>
         <w:tc>
           <w:tcPr>
-            <w:tcW w:w="3913" w:type="dxa"/>
-            <w:tcBorders>
-              <w:top w:val="single" w:sz="8" w:space="0" w:color="000000"/>
-              <w:left w:val="single" w:sz="8" w:space="0" w:color="000000"/>
-              <w:bottom w:val="single" w:sz="8" w:space="0" w:color="000000"/>
-              <w:right w:val="single" w:sz="8" w:space="0" w:color="000000"/>
-            </w:tcBorders>
-            <w:vAlign w:val="center"/>
-          </w:tcPr>
-          <w:p>
-            <w:pPr>
-              <w:jc w:val="both"/>
+            <w:tcW w:w="2835" w:type="dxa"/>
+            <w:tcBorders>
+              <w:top w:val="single" w:sz="8" w:space="0" w:color="000000"/>
+              <w:left w:val="single" w:sz="8" w:space="0" w:color="000000"/>
+              <w:bottom w:val="single" w:sz="8" w:space="0" w:color="000000"/>
+              <w:right w:val="single" w:sz="8" w:space="0" w:color="000000"/>
+            </w:tcBorders>
+            <w:vAlign w:val="center"/>
+          </w:tcPr>
+          <w:p>
+            <w:pPr>
+              <w:jc w:val="left"/>
               <w:rPr>
                 <w:sz w:val="24"/>
                 <w:szCs w:val="24"/>
@@ -4993,11 +5117,12 @@
       </w:tr>
       <w:tr>
         <w:trPr>
+          <w:cantSplit/>
           <w:jc w:val="center"/>
         </w:trPr>
         <w:tc>
           <w:tcPr>
-            <w:tcW w:w="3367" w:type="dxa"/>
+            <w:tcW w:w="4309" w:type="dxa"/>
             <w:tcBorders>
               <w:top w:val="single" w:sz="8" w:space="0" w:color="000000"/>
               <w:left w:val="single" w:sz="8" w:space="0" w:color="000000"/>
@@ -5025,7 +5150,7 @@
         </w:tc>
         <w:tc>
           <w:tcPr>
-            <w:tcW w:w="2248" w:type="dxa"/>
+            <w:tcW w:w="1927" w:type="dxa"/>
             <w:tcBorders>
               <w:top w:val="single" w:sz="8" w:space="0" w:color="000000"/>
               <w:left w:val="single" w:sz="8" w:space="0" w:color="000000"/>
@@ -5053,18 +5178,18 @@
         </w:tc>
         <w:tc>
           <w:tcPr>
-            <w:tcW w:w="3913" w:type="dxa"/>
-            <w:tcBorders>
-              <w:top w:val="single" w:sz="8" w:space="0" w:color="000000"/>
-              <w:left w:val="single" w:sz="8" w:space="0" w:color="000000"/>
-              <w:bottom w:val="single" w:sz="8" w:space="0" w:color="000000"/>
-              <w:right w:val="single" w:sz="8" w:space="0" w:color="000000"/>
-            </w:tcBorders>
-            <w:vAlign w:val="center"/>
-          </w:tcPr>
-          <w:p>
-            <w:pPr>
-              <w:jc w:val="both"/>
+            <w:tcW w:w="2835" w:type="dxa"/>
+            <w:tcBorders>
+              <w:top w:val="single" w:sz="8" w:space="0" w:color="000000"/>
+              <w:left w:val="single" w:sz="8" w:space="0" w:color="000000"/>
+              <w:bottom w:val="single" w:sz="8" w:space="0" w:color="000000"/>
+              <w:right w:val="single" w:sz="8" w:space="0" w:color="000000"/>
+            </w:tcBorders>
+            <w:vAlign w:val="center"/>
+          </w:tcPr>
+          <w:p>
+            <w:pPr>
+              <w:jc w:val="left"/>
               <w:rPr>
                 <w:sz w:val="24"/>
                 <w:szCs w:val="24"/>
@@ -5083,11 +5208,12 @@
       </w:tr>
       <w:tr>
         <w:trPr>
+          <w:cantSplit/>
           <w:jc w:val="center"/>
         </w:trPr>
         <w:tc>
           <w:tcPr>
-            <w:tcW w:w="3367" w:type="dxa"/>
+            <w:tcW w:w="4309" w:type="dxa"/>
             <w:tcBorders>
               <w:top w:val="single" w:sz="8" w:space="0" w:color="000000"/>
               <w:left w:val="single" w:sz="8" w:space="0" w:color="000000"/>
@@ -5115,7 +5241,7 @@
         </w:tc>
         <w:tc>
           <w:tcPr>
-            <w:tcW w:w="2248" w:type="dxa"/>
+            <w:tcW w:w="1927" w:type="dxa"/>
             <w:tcBorders>
               <w:top w:val="single" w:sz="8" w:space="0" w:color="000000"/>
               <w:left w:val="single" w:sz="8" w:space="0" w:color="000000"/>
@@ -5143,18 +5269,18 @@
         </w:tc>
         <w:tc>
           <w:tcPr>
-            <w:tcW w:w="3913" w:type="dxa"/>
-            <w:tcBorders>
-              <w:top w:val="single" w:sz="8" w:space="0" w:color="000000"/>
-              <w:left w:val="single" w:sz="8" w:space="0" w:color="000000"/>
-              <w:bottom w:val="single" w:sz="8" w:space="0" w:color="000000"/>
-              <w:right w:val="single" w:sz="8" w:space="0" w:color="000000"/>
-            </w:tcBorders>
-            <w:vAlign w:val="center"/>
-          </w:tcPr>
-          <w:p>
-            <w:pPr>
-              <w:jc w:val="both"/>
+            <w:tcW w:w="2835" w:type="dxa"/>
+            <w:tcBorders>
+              <w:top w:val="single" w:sz="8" w:space="0" w:color="000000"/>
+              <w:left w:val="single" w:sz="8" w:space="0" w:color="000000"/>
+              <w:bottom w:val="single" w:sz="8" w:space="0" w:color="000000"/>
+              <w:right w:val="single" w:sz="8" w:space="0" w:color="000000"/>
+            </w:tcBorders>
+            <w:vAlign w:val="center"/>
+          </w:tcPr>
+          <w:p>
+            <w:pPr>
+              <w:jc w:val="left"/>
               <w:rPr>
                 <w:sz w:val="24"/>
                 <w:szCs w:val="24"/>
@@ -5173,39 +5299,40 @@
       </w:tr>
       <w:tr>
         <w:trPr>
+          <w:cantSplit/>
           <w:jc w:val="center"/>
         </w:trPr>
         <w:tc>
           <w:tcPr>
-            <w:tcW w:w="3367" w:type="dxa"/>
-            <w:tcBorders>
-              <w:top w:val="single" w:sz="8" w:space="0" w:color="000000"/>
-              <w:left w:val="single" w:sz="8" w:space="0" w:color="000000"/>
-              <w:bottom w:val="single" w:sz="8" w:space="0" w:color="000000"/>
-              <w:right w:val="single" w:sz="8" w:space="0" w:color="000000"/>
-            </w:tcBorders>
-            <w:vAlign w:val="center"/>
-          </w:tcPr>
-          <w:p>
-            <w:pPr>
-              <w:rPr>
-                <w:sz w:val="24"/>
-                <w:szCs w:val="24"/>
-              </w:rPr>
-            </w:pPr>
-            <w:r>
-              <w:rPr>
-                <w:b w:val="0"/>
-                <w:sz w:val="24"/>
-                <w:szCs w:val="24"/>
-              </w:rPr>
-              <w:t>6. Jalankan PM yang mengubah sistem di window maintenance sesudah change disetujui.</w:t>
-            </w:r>
-          </w:p>
-        </w:tc>
-        <w:tc>
-          <w:tcPr>
-            <w:tcW w:w="2248" w:type="dxa"/>
+            <w:tcW w:w="4309" w:type="dxa"/>
+            <w:tcBorders>
+              <w:top w:val="single" w:sz="8" w:space="0" w:color="000000"/>
+              <w:left w:val="single" w:sz="8" w:space="0" w:color="000000"/>
+              <w:bottom w:val="single" w:sz="8" w:space="0" w:color="000000"/>
+              <w:right w:val="single" w:sz="8" w:space="0" w:color="000000"/>
+            </w:tcBorders>
+            <w:vAlign w:val="center"/>
+          </w:tcPr>
+          <w:p>
+            <w:pPr>
+              <w:rPr>
+                <w:sz w:val="24"/>
+                <w:szCs w:val="24"/>
+              </w:rPr>
+            </w:pPr>
+            <w:r>
+              <w:rPr>
+                <w:b w:val="0"/>
+                <w:sz w:val="24"/>
+                <w:szCs w:val="24"/>
+              </w:rPr>
+              <w:t>6. Jalankan PM yang mengubah sistem di window maintenance setelah change disetujui.</w:t>
+            </w:r>
+          </w:p>
+        </w:tc>
+        <w:tc>
+          <w:tcPr>
+            <w:tcW w:w="1927" w:type="dxa"/>
             <w:tcBorders>
               <w:top w:val="single" w:sz="8" w:space="0" w:color="000000"/>
               <w:left w:val="single" w:sz="8" w:space="0" w:color="000000"/>
@@ -5233,18 +5360,18 @@
         </w:tc>
         <w:tc>
           <w:tcPr>
-            <w:tcW w:w="3913" w:type="dxa"/>
-            <w:tcBorders>
-              <w:top w:val="single" w:sz="8" w:space="0" w:color="000000"/>
-              <w:left w:val="single" w:sz="8" w:space="0" w:color="000000"/>
-              <w:bottom w:val="single" w:sz="8" w:space="0" w:color="000000"/>
-              <w:right w:val="single" w:sz="8" w:space="0" w:color="000000"/>
-            </w:tcBorders>
-            <w:vAlign w:val="center"/>
-          </w:tcPr>
-          <w:p>
-            <w:pPr>
-              <w:jc w:val="both"/>
+            <w:tcW w:w="2835" w:type="dxa"/>
+            <w:tcBorders>
+              <w:top w:val="single" w:sz="8" w:space="0" w:color="000000"/>
+              <w:left w:val="single" w:sz="8" w:space="0" w:color="000000"/>
+              <w:bottom w:val="single" w:sz="8" w:space="0" w:color="000000"/>
+              <w:right w:val="single" w:sz="8" w:space="0" w:color="000000"/>
+            </w:tcBorders>
+            <w:vAlign w:val="center"/>
+          </w:tcPr>
+          <w:p>
+            <w:pPr>
+              <w:jc w:val="left"/>
               <w:rPr>
                 <w:sz w:val="24"/>
                 <w:szCs w:val="24"/>
@@ -5263,39 +5390,40 @@
       </w:tr>
       <w:tr>
         <w:trPr>
+          <w:cantSplit/>
           <w:jc w:val="center"/>
         </w:trPr>
         <w:tc>
           <w:tcPr>
-            <w:tcW w:w="3367" w:type="dxa"/>
-            <w:tcBorders>
-              <w:top w:val="single" w:sz="8" w:space="0" w:color="000000"/>
-              <w:left w:val="single" w:sz="8" w:space="0" w:color="000000"/>
-              <w:bottom w:val="single" w:sz="8" w:space="0" w:color="000000"/>
-              <w:right w:val="single" w:sz="8" w:space="0" w:color="000000"/>
-            </w:tcBorders>
-            <w:vAlign w:val="center"/>
-          </w:tcPr>
-          <w:p>
-            <w:pPr>
-              <w:rPr>
-                <w:sz w:val="24"/>
-                <w:szCs w:val="24"/>
-              </w:rPr>
-            </w:pPr>
-            <w:r>
-              <w:rPr>
-                <w:b w:val="0"/>
-                <w:sz w:val="24"/>
-                <w:szCs w:val="24"/>
-              </w:rPr>
-              <w:t>7. Tandai realisasi di sheet Jadwal PM: kode S bila siklus selesai, kode T bila tertunda.</w:t>
-            </w:r>
-          </w:p>
-        </w:tc>
-        <w:tc>
-          <w:tcPr>
-            <w:tcW w:w="2248" w:type="dxa"/>
+            <w:tcW w:w="4309" w:type="dxa"/>
+            <w:tcBorders>
+              <w:top w:val="single" w:sz="8" w:space="0" w:color="000000"/>
+              <w:left w:val="single" w:sz="8" w:space="0" w:color="000000"/>
+              <w:bottom w:val="single" w:sz="8" w:space="0" w:color="000000"/>
+              <w:right w:val="single" w:sz="8" w:space="0" w:color="000000"/>
+            </w:tcBorders>
+            <w:vAlign w:val="center"/>
+          </w:tcPr>
+          <w:p>
+            <w:pPr>
+              <w:rPr>
+                <w:sz w:val="24"/>
+                <w:szCs w:val="24"/>
+              </w:rPr>
+            </w:pPr>
+            <w:r>
+              <w:rPr>
+                <w:b w:val="0"/>
+                <w:sz w:val="24"/>
+                <w:szCs w:val="24"/>
+              </w:rPr>
+              <w:t>7. Tandai realisasi di sheet Jadwal PM: kode S jika siklus selesai, kode T jika tertunda.</w:t>
+            </w:r>
+          </w:p>
+        </w:tc>
+        <w:tc>
+          <w:tcPr>
+            <w:tcW w:w="1927" w:type="dxa"/>
             <w:tcBorders>
               <w:top w:val="single" w:sz="8" w:space="0" w:color="000000"/>
               <w:left w:val="single" w:sz="8" w:space="0" w:color="000000"/>
@@ -5323,18 +5451,18 @@
         </w:tc>
         <w:tc>
           <w:tcPr>
-            <w:tcW w:w="3913" w:type="dxa"/>
-            <w:tcBorders>
-              <w:top w:val="single" w:sz="8" w:space="0" w:color="000000"/>
-              <w:left w:val="single" w:sz="8" w:space="0" w:color="000000"/>
-              <w:bottom w:val="single" w:sz="8" w:space="0" w:color="000000"/>
-              <w:right w:val="single" w:sz="8" w:space="0" w:color="000000"/>
-            </w:tcBorders>
-            <w:vAlign w:val="center"/>
-          </w:tcPr>
-          <w:p>
-            <w:pPr>
-              <w:jc w:val="both"/>
+            <w:tcW w:w="2835" w:type="dxa"/>
+            <w:tcBorders>
+              <w:top w:val="single" w:sz="8" w:space="0" w:color="000000"/>
+              <w:left w:val="single" w:sz="8" w:space="0" w:color="000000"/>
+              <w:bottom w:val="single" w:sz="8" w:space="0" w:color="000000"/>
+              <w:right w:val="single" w:sz="8" w:space="0" w:color="000000"/>
+            </w:tcBorders>
+            <w:vAlign w:val="center"/>
+          </w:tcPr>
+          <w:p>
+            <w:pPr>
+              <w:jc w:val="left"/>
               <w:rPr>
                 <w:sz w:val="24"/>
                 <w:szCs w:val="24"/>
@@ -5353,11 +5481,12 @@
       </w:tr>
       <w:tr>
         <w:trPr>
+          <w:cantSplit/>
           <w:jc w:val="center"/>
         </w:trPr>
         <w:tc>
           <w:tcPr>
-            <w:tcW w:w="3367" w:type="dxa"/>
+            <w:tcW w:w="4309" w:type="dxa"/>
             <w:tcBorders>
               <w:top w:val="single" w:sz="8" w:space="0" w:color="000000"/>
               <w:left w:val="single" w:sz="8" w:space="0" w:color="000000"/>
@@ -5385,7 +5514,7 @@
         </w:tc>
         <w:tc>
           <w:tcPr>
-            <w:tcW w:w="2248" w:type="dxa"/>
+            <w:tcW w:w="1927" w:type="dxa"/>
             <w:tcBorders>
               <w:top w:val="single" w:sz="8" w:space="0" w:color="000000"/>
               <w:left w:val="single" w:sz="8" w:space="0" w:color="000000"/>
@@ -5413,18 +5542,18 @@
         </w:tc>
         <w:tc>
           <w:tcPr>
-            <w:tcW w:w="3913" w:type="dxa"/>
-            <w:tcBorders>
-              <w:top w:val="single" w:sz="8" w:space="0" w:color="000000"/>
-              <w:left w:val="single" w:sz="8" w:space="0" w:color="000000"/>
-              <w:bottom w:val="single" w:sz="8" w:space="0" w:color="000000"/>
-              <w:right w:val="single" w:sz="8" w:space="0" w:color="000000"/>
-            </w:tcBorders>
-            <w:vAlign w:val="center"/>
-          </w:tcPr>
-          <w:p>
-            <w:pPr>
-              <w:jc w:val="both"/>
+            <w:tcW w:w="2835" w:type="dxa"/>
+            <w:tcBorders>
+              <w:top w:val="single" w:sz="8" w:space="0" w:color="000000"/>
+              <w:left w:val="single" w:sz="8" w:space="0" w:color="000000"/>
+              <w:bottom w:val="single" w:sz="8" w:space="0" w:color="000000"/>
+              <w:right w:val="single" w:sz="8" w:space="0" w:color="000000"/>
+            </w:tcBorders>
+            <w:vAlign w:val="center"/>
+          </w:tcPr>
+          <w:p>
+            <w:pPr>
+              <w:jc w:val="left"/>
               <w:rPr>
                 <w:sz w:val="24"/>
                 <w:szCs w:val="24"/>
@@ -5443,11 +5572,12 @@
       </w:tr>
       <w:tr>
         <w:trPr>
+          <w:cantSplit/>
           <w:jc w:val="center"/>
         </w:trPr>
         <w:tc>
           <w:tcPr>
-            <w:tcW w:w="3367" w:type="dxa"/>
+            <w:tcW w:w="4309" w:type="dxa"/>
             <w:tcBorders>
               <w:top w:val="single" w:sz="8" w:space="0" w:color="000000"/>
               <w:left w:val="single" w:sz="8" w:space="0" w:color="000000"/>
@@ -5475,7 +5605,7 @@
         </w:tc>
         <w:tc>
           <w:tcPr>
-            <w:tcW w:w="2248" w:type="dxa"/>
+            <w:tcW w:w="1927" w:type="dxa"/>
             <w:tcBorders>
               <w:top w:val="single" w:sz="8" w:space="0" w:color="000000"/>
               <w:left w:val="single" w:sz="8" w:space="0" w:color="000000"/>
@@ -5503,30 +5633,30 @@
         </w:tc>
         <w:tc>
           <w:tcPr>
-            <w:tcW w:w="3913" w:type="dxa"/>
-            <w:tcBorders>
-              <w:top w:val="single" w:sz="8" w:space="0" w:color="000000"/>
-              <w:left w:val="single" w:sz="8" w:space="0" w:color="000000"/>
-              <w:bottom w:val="single" w:sz="8" w:space="0" w:color="000000"/>
-              <w:right w:val="single" w:sz="8" w:space="0" w:color="000000"/>
-            </w:tcBorders>
-            <w:vAlign w:val="center"/>
-          </w:tcPr>
-          <w:p>
-            <w:pPr>
-              <w:jc w:val="both"/>
-              <w:rPr>
-                <w:sz w:val="24"/>
-                <w:szCs w:val="24"/>
-              </w:rPr>
-            </w:pPr>
-            <w:r>
-              <w:rPr>
-                <w:b w:val="0"/>
-                <w:sz w:val="24"/>
-                <w:szCs w:val="24"/>
-              </w:rPr>
-              <w:t>Tiket CM (butir 6.4)</w:t>
+            <w:tcW w:w="2835" w:type="dxa"/>
+            <w:tcBorders>
+              <w:top w:val="single" w:sz="8" w:space="0" w:color="000000"/>
+              <w:left w:val="single" w:sz="8" w:space="0" w:color="000000"/>
+              <w:bottom w:val="single" w:sz="8" w:space="0" w:color="000000"/>
+              <w:right w:val="single" w:sz="8" w:space="0" w:color="000000"/>
+            </w:tcBorders>
+            <w:vAlign w:val="center"/>
+          </w:tcPr>
+          <w:p>
+            <w:pPr>
+              <w:jc w:val="left"/>
+              <w:rPr>
+                <w:sz w:val="24"/>
+                <w:szCs w:val="24"/>
+              </w:rPr>
+            </w:pPr>
+            <w:r>
+              <w:rPr>
+                <w:b w:val="0"/>
+                <w:sz w:val="24"/>
+                <w:szCs w:val="24"/>
+              </w:rPr>
+              <w:t>Ticket CM (butir 6.4)</w:t>
             </w:r>
           </w:p>
         </w:tc>
@@ -5559,6 +5689,7 @@
     <w:p>
       <w:pPr>
         <w:pStyle w:val="Heading2"/>
+        <w:keepNext/>
         <w:numPr>
           <w:ilvl w:val="1"/>
           <w:numId w:val="7"/>
@@ -5579,27 +5710,30 @@
         <w:tblLook w:val="0400" w:firstRow="0" w:lastRow="0" w:firstColumn="0" w:lastColumn="0" w:noHBand="0" w:noVBand="1"/>
       </w:tblPr>
       <w:tblGrid>
-        <w:gridCol w:w="3367"/>
-        <w:gridCol w:w="2248"/>
-        <w:gridCol w:w="3913"/>
+        <w:gridCol w:w="4309"/>
+        <w:gridCol w:w="1927"/>
+        <w:gridCol w:w="2835"/>
       </w:tblGrid>
       <w:tr>
         <w:trPr>
+          <w:cantSplit/>
+          <w:tblHeader/>
           <w:jc w:val="center"/>
         </w:trPr>
         <w:tc>
           <w:tcPr>
-            <w:tcW w:w="3367" w:type="dxa"/>
-            <w:tcBorders>
-              <w:top w:val="single" w:sz="8" w:space="0" w:color="000000"/>
-              <w:left w:val="single" w:sz="8" w:space="0" w:color="000000"/>
-              <w:bottom w:val="single" w:sz="8" w:space="0" w:color="000000"/>
-              <w:right w:val="single" w:sz="8" w:space="0" w:color="000000"/>
-            </w:tcBorders>
-            <w:vAlign w:val="center"/>
-          </w:tcPr>
-          <w:p>
-            <w:pPr>
+            <w:tcW w:w="4309" w:type="dxa"/>
+            <w:tcBorders>
+              <w:top w:val="single" w:sz="8" w:space="0" w:color="000000"/>
+              <w:left w:val="single" w:sz="8" w:space="0" w:color="000000"/>
+              <w:bottom w:val="single" w:sz="8" w:space="0" w:color="000000"/>
+              <w:right w:val="single" w:sz="8" w:space="0" w:color="000000"/>
+            </w:tcBorders>
+            <w:vAlign w:val="center"/>
+          </w:tcPr>
+          <w:p>
+            <w:pPr>
+              <w:keepNext/>
               <w:jc w:val="center"/>
               <w:rPr>
                 <w:sz w:val="24"/>
@@ -5619,17 +5753,18 @@
         </w:tc>
         <w:tc>
           <w:tcPr>
-            <w:tcW w:w="2248" w:type="dxa"/>
-            <w:tcBorders>
-              <w:top w:val="single" w:sz="8" w:space="0" w:color="000000"/>
-              <w:left w:val="single" w:sz="8" w:space="0" w:color="000000"/>
-              <w:bottom w:val="single" w:sz="8" w:space="0" w:color="000000"/>
-              <w:right w:val="single" w:sz="8" w:space="0" w:color="000000"/>
-            </w:tcBorders>
-            <w:vAlign w:val="center"/>
-          </w:tcPr>
-          <w:p>
-            <w:pPr>
+            <w:tcW w:w="1927" w:type="dxa"/>
+            <w:tcBorders>
+              <w:top w:val="single" w:sz="8" w:space="0" w:color="000000"/>
+              <w:left w:val="single" w:sz="8" w:space="0" w:color="000000"/>
+              <w:bottom w:val="single" w:sz="8" w:space="0" w:color="000000"/>
+              <w:right w:val="single" w:sz="8" w:space="0" w:color="000000"/>
+            </w:tcBorders>
+            <w:vAlign w:val="center"/>
+          </w:tcPr>
+          <w:p>
+            <w:pPr>
+              <w:keepNext/>
               <w:jc w:val="center"/>
               <w:rPr>
                 <w:sz w:val="24"/>
@@ -5649,17 +5784,18 @@
         </w:tc>
         <w:tc>
           <w:tcPr>
-            <w:tcW w:w="3913" w:type="dxa"/>
-            <w:tcBorders>
-              <w:top w:val="single" w:sz="8" w:space="0" w:color="000000"/>
-              <w:left w:val="single" w:sz="8" w:space="0" w:color="000000"/>
-              <w:bottom w:val="single" w:sz="8" w:space="0" w:color="000000"/>
-              <w:right w:val="single" w:sz="8" w:space="0" w:color="000000"/>
-            </w:tcBorders>
-            <w:vAlign w:val="center"/>
-          </w:tcPr>
-          <w:p>
-            <w:pPr>
+            <w:tcW w:w="2835" w:type="dxa"/>
+            <w:tcBorders>
+              <w:top w:val="single" w:sz="8" w:space="0" w:color="000000"/>
+              <w:left w:val="single" w:sz="8" w:space="0" w:color="000000"/>
+              <w:bottom w:val="single" w:sz="8" w:space="0" w:color="000000"/>
+              <w:right w:val="single" w:sz="8" w:space="0" w:color="000000"/>
+            </w:tcBorders>
+            <w:vAlign w:val="center"/>
+          </w:tcPr>
+          <w:p>
+            <w:pPr>
+              <w:keepNext/>
               <w:jc w:val="center"/>
               <w:rPr>
                 <w:sz w:val="24"/>
@@ -5680,11 +5816,12 @@
       </w:tr>
       <w:tr>
         <w:trPr>
+          <w:cantSplit/>
           <w:jc w:val="center"/>
         </w:trPr>
         <w:tc>
           <w:tcPr>
-            <w:tcW w:w="3367" w:type="dxa"/>
+            <w:tcW w:w="4309" w:type="dxa"/>
             <w:tcBorders>
               <w:top w:val="single" w:sz="8" w:space="0" w:color="000000"/>
               <w:left w:val="single" w:sz="8" w:space="0" w:color="000000"/>
@@ -5712,7 +5849,7 @@
         </w:tc>
         <w:tc>
           <w:tcPr>
-            <w:tcW w:w="2248" w:type="dxa"/>
+            <w:tcW w:w="1927" w:type="dxa"/>
             <w:tcBorders>
               <w:top w:val="single" w:sz="8" w:space="0" w:color="000000"/>
               <w:left w:val="single" w:sz="8" w:space="0" w:color="000000"/>
@@ -5740,18 +5877,18 @@
         </w:tc>
         <w:tc>
           <w:tcPr>
-            <w:tcW w:w="3913" w:type="dxa"/>
-            <w:tcBorders>
-              <w:top w:val="single" w:sz="8" w:space="0" w:color="000000"/>
-              <w:left w:val="single" w:sz="8" w:space="0" w:color="000000"/>
-              <w:bottom w:val="single" w:sz="8" w:space="0" w:color="000000"/>
-              <w:right w:val="single" w:sz="8" w:space="0" w:color="000000"/>
-            </w:tcBorders>
-            <w:vAlign w:val="center"/>
-          </w:tcPr>
-          <w:p>
-            <w:pPr>
-              <w:jc w:val="both"/>
+            <w:tcW w:w="2835" w:type="dxa"/>
+            <w:tcBorders>
+              <w:top w:val="single" w:sz="8" w:space="0" w:color="000000"/>
+              <w:left w:val="single" w:sz="8" w:space="0" w:color="000000"/>
+              <w:bottom w:val="single" w:sz="8" w:space="0" w:color="000000"/>
+              <w:right w:val="single" w:sz="8" w:space="0" w:color="000000"/>
+            </w:tcBorders>
+            <w:vAlign w:val="center"/>
+          </w:tcPr>
+          <w:p>
+            <w:pPr>
+              <w:jc w:val="left"/>
               <w:rPr>
                 <w:sz w:val="24"/>
                 <w:szCs w:val="24"/>
@@ -5770,11 +5907,12 @@
       </w:tr>
       <w:tr>
         <w:trPr>
+          <w:cantSplit/>
           <w:jc w:val="center"/>
         </w:trPr>
         <w:tc>
           <w:tcPr>
-            <w:tcW w:w="3367" w:type="dxa"/>
+            <w:tcW w:w="4309" w:type="dxa"/>
             <w:tcBorders>
               <w:top w:val="single" w:sz="8" w:space="0" w:color="000000"/>
               <w:left w:val="single" w:sz="8" w:space="0" w:color="000000"/>
@@ -5802,7 +5940,7 @@
         </w:tc>
         <w:tc>
           <w:tcPr>
-            <w:tcW w:w="2248" w:type="dxa"/>
+            <w:tcW w:w="1927" w:type="dxa"/>
             <w:tcBorders>
               <w:top w:val="single" w:sz="8" w:space="0" w:color="000000"/>
               <w:left w:val="single" w:sz="8" w:space="0" w:color="000000"/>
@@ -5830,18 +5968,18 @@
         </w:tc>
         <w:tc>
           <w:tcPr>
-            <w:tcW w:w="3913" w:type="dxa"/>
-            <w:tcBorders>
-              <w:top w:val="single" w:sz="8" w:space="0" w:color="000000"/>
-              <w:left w:val="single" w:sz="8" w:space="0" w:color="000000"/>
-              <w:bottom w:val="single" w:sz="8" w:space="0" w:color="000000"/>
-              <w:right w:val="single" w:sz="8" w:space="0" w:color="000000"/>
-            </w:tcBorders>
-            <w:vAlign w:val="center"/>
-          </w:tcPr>
-          <w:p>
-            <w:pPr>
-              <w:jc w:val="both"/>
+            <w:tcW w:w="2835" w:type="dxa"/>
+            <w:tcBorders>
+              <w:top w:val="single" w:sz="8" w:space="0" w:color="000000"/>
+              <w:left w:val="single" w:sz="8" w:space="0" w:color="000000"/>
+              <w:bottom w:val="single" w:sz="8" w:space="0" w:color="000000"/>
+              <w:right w:val="single" w:sz="8" w:space="0" w:color="000000"/>
+            </w:tcBorders>
+            <w:vAlign w:val="center"/>
+          </w:tcPr>
+          <w:p>
+            <w:pPr>
+              <w:jc w:val="left"/>
               <w:rPr>
                 <w:sz w:val="24"/>
                 <w:szCs w:val="24"/>
@@ -5860,11 +5998,12 @@
       </w:tr>
       <w:tr>
         <w:trPr>
+          <w:cantSplit/>
           <w:jc w:val="center"/>
         </w:trPr>
         <w:tc>
           <w:tcPr>
-            <w:tcW w:w="3367" w:type="dxa"/>
+            <w:tcW w:w="4309" w:type="dxa"/>
             <w:tcBorders>
               <w:top w:val="single" w:sz="8" w:space="0" w:color="000000"/>
               <w:left w:val="single" w:sz="8" w:space="0" w:color="000000"/>
@@ -5892,7 +6031,7 @@
         </w:tc>
         <w:tc>
           <w:tcPr>
-            <w:tcW w:w="2248" w:type="dxa"/>
+            <w:tcW w:w="1927" w:type="dxa"/>
             <w:tcBorders>
               <w:top w:val="single" w:sz="8" w:space="0" w:color="000000"/>
               <w:left w:val="single" w:sz="8" w:space="0" w:color="000000"/>
@@ -5920,18 +6059,18 @@
         </w:tc>
         <w:tc>
           <w:tcPr>
-            <w:tcW w:w="3913" w:type="dxa"/>
-            <w:tcBorders>
-              <w:top w:val="single" w:sz="8" w:space="0" w:color="000000"/>
-              <w:left w:val="single" w:sz="8" w:space="0" w:color="000000"/>
-              <w:bottom w:val="single" w:sz="8" w:space="0" w:color="000000"/>
-              <w:right w:val="single" w:sz="8" w:space="0" w:color="000000"/>
-            </w:tcBorders>
-            <w:vAlign w:val="center"/>
-          </w:tcPr>
-          <w:p>
-            <w:pPr>
-              <w:jc w:val="both"/>
+            <w:tcW w:w="2835" w:type="dxa"/>
+            <w:tcBorders>
+              <w:top w:val="single" w:sz="8" w:space="0" w:color="000000"/>
+              <w:left w:val="single" w:sz="8" w:space="0" w:color="000000"/>
+              <w:bottom w:val="single" w:sz="8" w:space="0" w:color="000000"/>
+              <w:right w:val="single" w:sz="8" w:space="0" w:color="000000"/>
+            </w:tcBorders>
+            <w:vAlign w:val="center"/>
+          </w:tcPr>
+          <w:p>
+            <w:pPr>
+              <w:jc w:val="left"/>
               <w:rPr>
                 <w:sz w:val="24"/>
                 <w:szCs w:val="24"/>
@@ -5950,39 +6089,40 @@
       </w:tr>
       <w:tr>
         <w:trPr>
+          <w:cantSplit/>
           <w:jc w:val="center"/>
         </w:trPr>
         <w:tc>
           <w:tcPr>
-            <w:tcW w:w="3367" w:type="dxa"/>
-            <w:tcBorders>
-              <w:top w:val="single" w:sz="8" w:space="0" w:color="000000"/>
-              <w:left w:val="single" w:sz="8" w:space="0" w:color="000000"/>
-              <w:bottom w:val="single" w:sz="8" w:space="0" w:color="000000"/>
-              <w:right w:val="single" w:sz="8" w:space="0" w:color="000000"/>
-            </w:tcBorders>
-            <w:vAlign w:val="center"/>
-          </w:tcPr>
-          <w:p>
-            <w:pPr>
-              <w:rPr>
-                <w:sz w:val="24"/>
-                <w:szCs w:val="24"/>
-              </w:rPr>
-            </w:pPr>
-            <w:r>
-              <w:rPr>
-                <w:b w:val="0"/>
-                <w:sz w:val="24"/>
-                <w:szCs w:val="24"/>
-              </w:rPr>
-              <w:t>4. Susun RCA di SNX-OPS-FRM-10 bila hasil evaluasi menunjukkan RCA perlu.</w:t>
-            </w:r>
-          </w:p>
-        </w:tc>
-        <w:tc>
-          <w:tcPr>
-            <w:tcW w:w="2248" w:type="dxa"/>
+            <w:tcW w:w="4309" w:type="dxa"/>
+            <w:tcBorders>
+              <w:top w:val="single" w:sz="8" w:space="0" w:color="000000"/>
+              <w:left w:val="single" w:sz="8" w:space="0" w:color="000000"/>
+              <w:bottom w:val="single" w:sz="8" w:space="0" w:color="000000"/>
+              <w:right w:val="single" w:sz="8" w:space="0" w:color="000000"/>
+            </w:tcBorders>
+            <w:vAlign w:val="center"/>
+          </w:tcPr>
+          <w:p>
+            <w:pPr>
+              <w:rPr>
+                <w:sz w:val="24"/>
+                <w:szCs w:val="24"/>
+              </w:rPr>
+            </w:pPr>
+            <w:r>
+              <w:rPr>
+                <w:b w:val="0"/>
+                <w:sz w:val="24"/>
+                <w:szCs w:val="24"/>
+              </w:rPr>
+              <w:t>4. Susun RCA di SNX-OPS-FRM-10 jika hasil evaluasi menunjukkan RCA diperlukan.</w:t>
+            </w:r>
+          </w:p>
+        </w:tc>
+        <w:tc>
+          <w:tcPr>
+            <w:tcW w:w="1927" w:type="dxa"/>
             <w:tcBorders>
               <w:top w:val="single" w:sz="8" w:space="0" w:color="000000"/>
               <w:left w:val="single" w:sz="8" w:space="0" w:color="000000"/>
@@ -6010,18 +6150,18 @@
         </w:tc>
         <w:tc>
           <w:tcPr>
-            <w:tcW w:w="3913" w:type="dxa"/>
-            <w:tcBorders>
-              <w:top w:val="single" w:sz="8" w:space="0" w:color="000000"/>
-              <w:left w:val="single" w:sz="8" w:space="0" w:color="000000"/>
-              <w:bottom w:val="single" w:sz="8" w:space="0" w:color="000000"/>
-              <w:right w:val="single" w:sz="8" w:space="0" w:color="000000"/>
-            </w:tcBorders>
-            <w:vAlign w:val="center"/>
-          </w:tcPr>
-          <w:p>
-            <w:pPr>
-              <w:jc w:val="both"/>
+            <w:tcW w:w="2835" w:type="dxa"/>
+            <w:tcBorders>
+              <w:top w:val="single" w:sz="8" w:space="0" w:color="000000"/>
+              <w:left w:val="single" w:sz="8" w:space="0" w:color="000000"/>
+              <w:bottom w:val="single" w:sz="8" w:space="0" w:color="000000"/>
+              <w:right w:val="single" w:sz="8" w:space="0" w:color="000000"/>
+            </w:tcBorders>
+            <w:vAlign w:val="center"/>
+          </w:tcPr>
+          <w:p>
+            <w:pPr>
+              <w:jc w:val="left"/>
               <w:rPr>
                 <w:sz w:val="24"/>
                 <w:szCs w:val="24"/>
@@ -6040,11 +6180,12 @@
       </w:tr>
       <w:tr>
         <w:trPr>
+          <w:cantSplit/>
           <w:jc w:val="center"/>
         </w:trPr>
         <w:tc>
           <w:tcPr>
-            <w:tcW w:w="3367" w:type="dxa"/>
+            <w:tcW w:w="4309" w:type="dxa"/>
             <w:tcBorders>
               <w:top w:val="single" w:sz="8" w:space="0" w:color="000000"/>
               <w:left w:val="single" w:sz="8" w:space="0" w:color="000000"/>
@@ -6072,7 +6213,7 @@
         </w:tc>
         <w:tc>
           <w:tcPr>
-            <w:tcW w:w="2248" w:type="dxa"/>
+            <w:tcW w:w="1927" w:type="dxa"/>
             <w:tcBorders>
               <w:top w:val="single" w:sz="8" w:space="0" w:color="000000"/>
               <w:left w:val="single" w:sz="8" w:space="0" w:color="000000"/>
@@ -6100,41 +6241,42 @@
         </w:tc>
         <w:tc>
           <w:tcPr>
-            <w:tcW w:w="3913" w:type="dxa"/>
-            <w:tcBorders>
-              <w:top w:val="single" w:sz="8" w:space="0" w:color="000000"/>
-              <w:left w:val="single" w:sz="8" w:space="0" w:color="000000"/>
-              <w:bottom w:val="single" w:sz="8" w:space="0" w:color="000000"/>
-              <w:right w:val="single" w:sz="8" w:space="0" w:color="000000"/>
-            </w:tcBorders>
-            <w:vAlign w:val="center"/>
-          </w:tcPr>
-          <w:p>
-            <w:pPr>
-              <w:jc w:val="both"/>
-              <w:rPr>
-                <w:sz w:val="24"/>
-                <w:szCs w:val="24"/>
-              </w:rPr>
-            </w:pPr>
-            <w:r>
-              <w:rPr>
-                <w:b w:val="0"/>
-                <w:sz w:val="24"/>
-                <w:szCs w:val="24"/>
-              </w:rPr>
-              <w:t>Hasil tinjauan insiden bulanan</w:t>
+            <w:tcW w:w="2835" w:type="dxa"/>
+            <w:tcBorders>
+              <w:top w:val="single" w:sz="8" w:space="0" w:color="000000"/>
+              <w:left w:val="single" w:sz="8" w:space="0" w:color="000000"/>
+              <w:bottom w:val="single" w:sz="8" w:space="0" w:color="000000"/>
+              <w:right w:val="single" w:sz="8" w:space="0" w:color="000000"/>
+            </w:tcBorders>
+            <w:vAlign w:val="center"/>
+          </w:tcPr>
+          <w:p>
+            <w:pPr>
+              <w:jc w:val="left"/>
+              <w:rPr>
+                <w:sz w:val="24"/>
+                <w:szCs w:val="24"/>
+              </w:rPr>
+            </w:pPr>
+            <w:r>
+              <w:rPr>
+                <w:b w:val="0"/>
+                <w:sz w:val="24"/>
+                <w:szCs w:val="24"/>
+              </w:rPr>
+              <w:t>Hasil review insiden bulanan</w:t>
             </w:r>
           </w:p>
         </w:tc>
       </w:tr>
       <w:tr>
         <w:trPr>
+          <w:cantSplit/>
           <w:jc w:val="center"/>
         </w:trPr>
         <w:tc>
           <w:tcPr>
-            <w:tcW w:w="3367" w:type="dxa"/>
+            <w:tcW w:w="4309" w:type="dxa"/>
             <w:tcBorders>
               <w:top w:val="single" w:sz="8" w:space="0" w:color="000000"/>
               <w:left w:val="single" w:sz="8" w:space="0" w:color="000000"/>
@@ -6162,7 +6304,7 @@
         </w:tc>
         <w:tc>
           <w:tcPr>
-            <w:tcW w:w="2248" w:type="dxa"/>
+            <w:tcW w:w="1927" w:type="dxa"/>
             <w:tcBorders>
               <w:top w:val="single" w:sz="8" w:space="0" w:color="000000"/>
               <w:left w:val="single" w:sz="8" w:space="0" w:color="000000"/>
@@ -6190,18 +6332,18 @@
         </w:tc>
         <w:tc>
           <w:tcPr>
-            <w:tcW w:w="3913" w:type="dxa"/>
-            <w:tcBorders>
-              <w:top w:val="single" w:sz="8" w:space="0" w:color="000000"/>
-              <w:left w:val="single" w:sz="8" w:space="0" w:color="000000"/>
-              <w:bottom w:val="single" w:sz="8" w:space="0" w:color="000000"/>
-              <w:right w:val="single" w:sz="8" w:space="0" w:color="000000"/>
-            </w:tcBorders>
-            <w:vAlign w:val="center"/>
-          </w:tcPr>
-          <w:p>
-            <w:pPr>
-              <w:jc w:val="both"/>
+            <w:tcW w:w="2835" w:type="dxa"/>
+            <w:tcBorders>
+              <w:top w:val="single" w:sz="8" w:space="0" w:color="000000"/>
+              <w:left w:val="single" w:sz="8" w:space="0" w:color="000000"/>
+              <w:bottom w:val="single" w:sz="8" w:space="0" w:color="000000"/>
+              <w:right w:val="single" w:sz="8" w:space="0" w:color="000000"/>
+            </w:tcBorders>
+            <w:vAlign w:val="center"/>
+          </w:tcPr>
+          <w:p>
+            <w:pPr>
+              <w:jc w:val="left"/>
               <w:rPr>
                 <w:sz w:val="24"/>
                 <w:szCs w:val="24"/>
@@ -6246,6 +6388,7 @@
     <w:p>
       <w:pPr>
         <w:pStyle w:val="Heading2"/>
+        <w:keepNext/>
         <w:numPr>
           <w:ilvl w:val="1"/>
           <w:numId w:val="7"/>
@@ -6266,27 +6409,30 @@
         <w:tblLook w:val="0400" w:firstRow="0" w:lastRow="0" w:firstColumn="0" w:lastColumn="0" w:noHBand="0" w:noVBand="1"/>
       </w:tblPr>
       <w:tblGrid>
-        <w:gridCol w:w="3367"/>
-        <w:gridCol w:w="2248"/>
-        <w:gridCol w:w="3913"/>
+        <w:gridCol w:w="4309"/>
+        <w:gridCol w:w="1927"/>
+        <w:gridCol w:w="2835"/>
       </w:tblGrid>
       <w:tr>
         <w:trPr>
+          <w:cantSplit/>
+          <w:tblHeader/>
           <w:jc w:val="center"/>
         </w:trPr>
         <w:tc>
           <w:tcPr>
-            <w:tcW w:w="3367" w:type="dxa"/>
-            <w:tcBorders>
-              <w:top w:val="single" w:sz="8" w:space="0" w:color="000000"/>
-              <w:left w:val="single" w:sz="8" w:space="0" w:color="000000"/>
-              <w:bottom w:val="single" w:sz="8" w:space="0" w:color="000000"/>
-              <w:right w:val="single" w:sz="8" w:space="0" w:color="000000"/>
-            </w:tcBorders>
-            <w:vAlign w:val="center"/>
-          </w:tcPr>
-          <w:p>
-            <w:pPr>
+            <w:tcW w:w="4309" w:type="dxa"/>
+            <w:tcBorders>
+              <w:top w:val="single" w:sz="8" w:space="0" w:color="000000"/>
+              <w:left w:val="single" w:sz="8" w:space="0" w:color="000000"/>
+              <w:bottom w:val="single" w:sz="8" w:space="0" w:color="000000"/>
+              <w:right w:val="single" w:sz="8" w:space="0" w:color="000000"/>
+            </w:tcBorders>
+            <w:vAlign w:val="center"/>
+          </w:tcPr>
+          <w:p>
+            <w:pPr>
+              <w:keepNext/>
               <w:jc w:val="center"/>
               <w:rPr>
                 <w:sz w:val="24"/>
@@ -6306,17 +6452,18 @@
         </w:tc>
         <w:tc>
           <w:tcPr>
-            <w:tcW w:w="2248" w:type="dxa"/>
-            <w:tcBorders>
-              <w:top w:val="single" w:sz="8" w:space="0" w:color="000000"/>
-              <w:left w:val="single" w:sz="8" w:space="0" w:color="000000"/>
-              <w:bottom w:val="single" w:sz="8" w:space="0" w:color="000000"/>
-              <w:right w:val="single" w:sz="8" w:space="0" w:color="000000"/>
-            </w:tcBorders>
-            <w:vAlign w:val="center"/>
-          </w:tcPr>
-          <w:p>
-            <w:pPr>
+            <w:tcW w:w="1927" w:type="dxa"/>
+            <w:tcBorders>
+              <w:top w:val="single" w:sz="8" w:space="0" w:color="000000"/>
+              <w:left w:val="single" w:sz="8" w:space="0" w:color="000000"/>
+              <w:bottom w:val="single" w:sz="8" w:space="0" w:color="000000"/>
+              <w:right w:val="single" w:sz="8" w:space="0" w:color="000000"/>
+            </w:tcBorders>
+            <w:vAlign w:val="center"/>
+          </w:tcPr>
+          <w:p>
+            <w:pPr>
+              <w:keepNext/>
               <w:jc w:val="center"/>
               <w:rPr>
                 <w:sz w:val="24"/>
@@ -6336,17 +6483,18 @@
         </w:tc>
         <w:tc>
           <w:tcPr>
-            <w:tcW w:w="3913" w:type="dxa"/>
-            <w:tcBorders>
-              <w:top w:val="single" w:sz="8" w:space="0" w:color="000000"/>
-              <w:left w:val="single" w:sz="8" w:space="0" w:color="000000"/>
-              <w:bottom w:val="single" w:sz="8" w:space="0" w:color="000000"/>
-              <w:right w:val="single" w:sz="8" w:space="0" w:color="000000"/>
-            </w:tcBorders>
-            <w:vAlign w:val="center"/>
-          </w:tcPr>
-          <w:p>
-            <w:pPr>
+            <w:tcW w:w="2835" w:type="dxa"/>
+            <w:tcBorders>
+              <w:top w:val="single" w:sz="8" w:space="0" w:color="000000"/>
+              <w:left w:val="single" w:sz="8" w:space="0" w:color="000000"/>
+              <w:bottom w:val="single" w:sz="8" w:space="0" w:color="000000"/>
+              <w:right w:val="single" w:sz="8" w:space="0" w:color="000000"/>
+            </w:tcBorders>
+            <w:vAlign w:val="center"/>
+          </w:tcPr>
+          <w:p>
+            <w:pPr>
+              <w:keepNext/>
               <w:jc w:val="center"/>
               <w:rPr>
                 <w:sz w:val="24"/>
@@ -6367,39 +6515,40 @@
       </w:tr>
       <w:tr>
         <w:trPr>
+          <w:cantSplit/>
           <w:jc w:val="center"/>
         </w:trPr>
         <w:tc>
           <w:tcPr>
-            <w:tcW w:w="3367" w:type="dxa"/>
-            <w:tcBorders>
-              <w:top w:val="single" w:sz="8" w:space="0" w:color="000000"/>
-              <w:left w:val="single" w:sz="8" w:space="0" w:color="000000"/>
-              <w:bottom w:val="single" w:sz="8" w:space="0" w:color="000000"/>
-              <w:right w:val="single" w:sz="8" w:space="0" w:color="000000"/>
-            </w:tcBorders>
-            <w:vAlign w:val="center"/>
-          </w:tcPr>
-          <w:p>
-            <w:pPr>
-              <w:rPr>
-                <w:sz w:val="24"/>
-                <w:szCs w:val="24"/>
-              </w:rPr>
-            </w:pPr>
-            <w:r>
-              <w:rPr>
-                <w:b w:val="0"/>
-                <w:sz w:val="24"/>
-                <w:szCs w:val="24"/>
-              </w:rPr>
-              <w:t>1. Catat kerusakan atau penurunan kinerja sebagai tiket di Zammad dan di SNX-OPS-FRM-08.</w:t>
-            </w:r>
-          </w:p>
-        </w:tc>
-        <w:tc>
-          <w:tcPr>
-            <w:tcW w:w="2248" w:type="dxa"/>
+            <w:tcW w:w="4309" w:type="dxa"/>
+            <w:tcBorders>
+              <w:top w:val="single" w:sz="8" w:space="0" w:color="000000"/>
+              <w:left w:val="single" w:sz="8" w:space="0" w:color="000000"/>
+              <w:bottom w:val="single" w:sz="8" w:space="0" w:color="000000"/>
+              <w:right w:val="single" w:sz="8" w:space="0" w:color="000000"/>
+            </w:tcBorders>
+            <w:vAlign w:val="center"/>
+          </w:tcPr>
+          <w:p>
+            <w:pPr>
+              <w:rPr>
+                <w:sz w:val="24"/>
+                <w:szCs w:val="24"/>
+              </w:rPr>
+            </w:pPr>
+            <w:r>
+              <w:rPr>
+                <w:b w:val="0"/>
+                <w:sz w:val="24"/>
+                <w:szCs w:val="24"/>
+              </w:rPr>
+              <w:t>1. Catat kerusakan atau penurunan kinerja sebagai ticket di Zammad dan di SNX-OPS-FRM-08.</w:t>
+            </w:r>
+          </w:p>
+        </w:tc>
+        <w:tc>
+          <w:tcPr>
+            <w:tcW w:w="1927" w:type="dxa"/>
             <w:tcBorders>
               <w:top w:val="single" w:sz="8" w:space="0" w:color="000000"/>
               <w:left w:val="single" w:sz="8" w:space="0" w:color="000000"/>
@@ -6427,69 +6576,70 @@
         </w:tc>
         <w:tc>
           <w:tcPr>
-            <w:tcW w:w="3913" w:type="dxa"/>
-            <w:tcBorders>
-              <w:top w:val="single" w:sz="8" w:space="0" w:color="000000"/>
-              <w:left w:val="single" w:sz="8" w:space="0" w:color="000000"/>
-              <w:bottom w:val="single" w:sz="8" w:space="0" w:color="000000"/>
-              <w:right w:val="single" w:sz="8" w:space="0" w:color="000000"/>
-            </w:tcBorders>
-            <w:vAlign w:val="center"/>
-          </w:tcPr>
-          <w:p>
-            <w:pPr>
-              <w:jc w:val="both"/>
-              <w:rPr>
-                <w:sz w:val="24"/>
-                <w:szCs w:val="24"/>
-              </w:rPr>
-            </w:pPr>
-            <w:r>
-              <w:rPr>
-                <w:b w:val="0"/>
-                <w:sz w:val="24"/>
-                <w:szCs w:val="24"/>
-              </w:rPr>
-              <w:t>Tiket di Zammad dan baris di SNX-OPS-FRM-08</w:t>
+            <w:tcW w:w="2835" w:type="dxa"/>
+            <w:tcBorders>
+              <w:top w:val="single" w:sz="8" w:space="0" w:color="000000"/>
+              <w:left w:val="single" w:sz="8" w:space="0" w:color="000000"/>
+              <w:bottom w:val="single" w:sz="8" w:space="0" w:color="000000"/>
+              <w:right w:val="single" w:sz="8" w:space="0" w:color="000000"/>
+            </w:tcBorders>
+            <w:vAlign w:val="center"/>
+          </w:tcPr>
+          <w:p>
+            <w:pPr>
+              <w:jc w:val="left"/>
+              <w:rPr>
+                <w:sz w:val="24"/>
+                <w:szCs w:val="24"/>
+              </w:rPr>
+            </w:pPr>
+            <w:r>
+              <w:rPr>
+                <w:b w:val="0"/>
+                <w:sz w:val="24"/>
+                <w:szCs w:val="24"/>
+              </w:rPr>
+              <w:t>Ticket di Zammad dan baris di SNX-OPS-FRM-08</w:t>
             </w:r>
           </w:p>
         </w:tc>
       </w:tr>
       <w:tr>
         <w:trPr>
+          <w:cantSplit/>
           <w:jc w:val="center"/>
         </w:trPr>
         <w:tc>
           <w:tcPr>
-            <w:tcW w:w="3367" w:type="dxa"/>
-            <w:tcBorders>
-              <w:top w:val="single" w:sz="8" w:space="0" w:color="000000"/>
-              <w:left w:val="single" w:sz="8" w:space="0" w:color="000000"/>
-              <w:bottom w:val="single" w:sz="8" w:space="0" w:color="000000"/>
-              <w:right w:val="single" w:sz="8" w:space="0" w:color="000000"/>
-            </w:tcBorders>
-            <w:vAlign w:val="center"/>
-          </w:tcPr>
-          <w:p>
-            <w:pPr>
-              <w:rPr>
-                <w:sz w:val="24"/>
-                <w:szCs w:val="24"/>
-              </w:rPr>
-            </w:pPr>
-            <w:r>
-              <w:rPr>
-                <w:b w:val="0"/>
-                <w:sz w:val="24"/>
-                <w:szCs w:val="24"/>
-              </w:rPr>
-              <w:t>2. Tetapkan severity tiket sesuai SNX-OPS-SOP-04.</w:t>
-            </w:r>
-          </w:p>
-        </w:tc>
-        <w:tc>
-          <w:tcPr>
-            <w:tcW w:w="2248" w:type="dxa"/>
+            <w:tcW w:w="4309" w:type="dxa"/>
+            <w:tcBorders>
+              <w:top w:val="single" w:sz="8" w:space="0" w:color="000000"/>
+              <w:left w:val="single" w:sz="8" w:space="0" w:color="000000"/>
+              <w:bottom w:val="single" w:sz="8" w:space="0" w:color="000000"/>
+              <w:right w:val="single" w:sz="8" w:space="0" w:color="000000"/>
+            </w:tcBorders>
+            <w:vAlign w:val="center"/>
+          </w:tcPr>
+          <w:p>
+            <w:pPr>
+              <w:rPr>
+                <w:sz w:val="24"/>
+                <w:szCs w:val="24"/>
+              </w:rPr>
+            </w:pPr>
+            <w:r>
+              <w:rPr>
+                <w:b w:val="0"/>
+                <w:sz w:val="24"/>
+                <w:szCs w:val="24"/>
+              </w:rPr>
+              <w:t>2. Tetapkan severity ticket sesuai SNX-OPS-SOP-04.</w:t>
+            </w:r>
+          </w:p>
+        </w:tc>
+        <w:tc>
+          <w:tcPr>
+            <w:tcW w:w="1927" w:type="dxa"/>
             <w:tcBorders>
               <w:top w:val="single" w:sz="8" w:space="0" w:color="000000"/>
               <w:left w:val="single" w:sz="8" w:space="0" w:color="000000"/>
@@ -6517,69 +6667,70 @@
         </w:tc>
         <w:tc>
           <w:tcPr>
-            <w:tcW w:w="3913" w:type="dxa"/>
-            <w:tcBorders>
-              <w:top w:val="single" w:sz="8" w:space="0" w:color="000000"/>
-              <w:left w:val="single" w:sz="8" w:space="0" w:color="000000"/>
-              <w:bottom w:val="single" w:sz="8" w:space="0" w:color="000000"/>
-              <w:right w:val="single" w:sz="8" w:space="0" w:color="000000"/>
-            </w:tcBorders>
-            <w:vAlign w:val="center"/>
-          </w:tcPr>
-          <w:p>
-            <w:pPr>
-              <w:jc w:val="both"/>
-              <w:rPr>
-                <w:sz w:val="24"/>
-                <w:szCs w:val="24"/>
-              </w:rPr>
-            </w:pPr>
-            <w:r>
-              <w:rPr>
-                <w:b w:val="0"/>
-                <w:sz w:val="24"/>
-                <w:szCs w:val="24"/>
-              </w:rPr>
-              <w:t>Severity pada tiket</w:t>
+            <w:tcW w:w="2835" w:type="dxa"/>
+            <w:tcBorders>
+              <w:top w:val="single" w:sz="8" w:space="0" w:color="000000"/>
+              <w:left w:val="single" w:sz="8" w:space="0" w:color="000000"/>
+              <w:bottom w:val="single" w:sz="8" w:space="0" w:color="000000"/>
+              <w:right w:val="single" w:sz="8" w:space="0" w:color="000000"/>
+            </w:tcBorders>
+            <w:vAlign w:val="center"/>
+          </w:tcPr>
+          <w:p>
+            <w:pPr>
+              <w:jc w:val="left"/>
+              <w:rPr>
+                <w:sz w:val="24"/>
+                <w:szCs w:val="24"/>
+              </w:rPr>
+            </w:pPr>
+            <w:r>
+              <w:rPr>
+                <w:b w:val="0"/>
+                <w:sz w:val="24"/>
+                <w:szCs w:val="24"/>
+              </w:rPr>
+              <w:t>Severity pada ticket</w:t>
             </w:r>
           </w:p>
         </w:tc>
       </w:tr>
       <w:tr>
         <w:trPr>
+          <w:cantSplit/>
           <w:jc w:val="center"/>
         </w:trPr>
         <w:tc>
           <w:tcPr>
-            <w:tcW w:w="3367" w:type="dxa"/>
-            <w:tcBorders>
-              <w:top w:val="single" w:sz="8" w:space="0" w:color="000000"/>
-              <w:left w:val="single" w:sz="8" w:space="0" w:color="000000"/>
-              <w:bottom w:val="single" w:sz="8" w:space="0" w:color="000000"/>
-              <w:right w:val="single" w:sz="8" w:space="0" w:color="000000"/>
-            </w:tcBorders>
-            <w:vAlign w:val="center"/>
-          </w:tcPr>
-          <w:p>
-            <w:pPr>
-              <w:rPr>
-                <w:sz w:val="24"/>
-                <w:szCs w:val="24"/>
-              </w:rPr>
-            </w:pPr>
-            <w:r>
-              <w:rPr>
-                <w:b w:val="0"/>
-                <w:sz w:val="24"/>
-                <w:szCs w:val="24"/>
-              </w:rPr>
-              <w:t>3. Diagnosa dengan pemeriksaan read-only dan bedakan gejala dari akar penyebab.</w:t>
-            </w:r>
-          </w:p>
-        </w:tc>
-        <w:tc>
-          <w:tcPr>
-            <w:tcW w:w="2248" w:type="dxa"/>
+            <w:tcW w:w="4309" w:type="dxa"/>
+            <w:tcBorders>
+              <w:top w:val="single" w:sz="8" w:space="0" w:color="000000"/>
+              <w:left w:val="single" w:sz="8" w:space="0" w:color="000000"/>
+              <w:bottom w:val="single" w:sz="8" w:space="0" w:color="000000"/>
+              <w:right w:val="single" w:sz="8" w:space="0" w:color="000000"/>
+            </w:tcBorders>
+            <w:vAlign w:val="center"/>
+          </w:tcPr>
+          <w:p>
+            <w:pPr>
+              <w:rPr>
+                <w:sz w:val="24"/>
+                <w:szCs w:val="24"/>
+              </w:rPr>
+            </w:pPr>
+            <w:r>
+              <w:rPr>
+                <w:b w:val="0"/>
+                <w:sz w:val="24"/>
+                <w:szCs w:val="24"/>
+              </w:rPr>
+              <w:t>3. Lakukan diagnosis dengan pemeriksaan read-only, lalu bedakan gejala dari root cause.</w:t>
+            </w:r>
+          </w:p>
+        </w:tc>
+        <w:tc>
+          <w:tcPr>
+            <w:tcW w:w="1927" w:type="dxa"/>
             <w:tcBorders>
               <w:top w:val="single" w:sz="8" w:space="0" w:color="000000"/>
               <w:left w:val="single" w:sz="8" w:space="0" w:color="000000"/>
@@ -6607,69 +6758,70 @@
         </w:tc>
         <w:tc>
           <w:tcPr>
-            <w:tcW w:w="3913" w:type="dxa"/>
-            <w:tcBorders>
-              <w:top w:val="single" w:sz="8" w:space="0" w:color="000000"/>
-              <w:left w:val="single" w:sz="8" w:space="0" w:color="000000"/>
-              <w:bottom w:val="single" w:sz="8" w:space="0" w:color="000000"/>
-              <w:right w:val="single" w:sz="8" w:space="0" w:color="000000"/>
-            </w:tcBorders>
-            <w:vAlign w:val="center"/>
-          </w:tcPr>
-          <w:p>
-            <w:pPr>
-              <w:jc w:val="both"/>
-              <w:rPr>
-                <w:sz w:val="24"/>
-                <w:szCs w:val="24"/>
-              </w:rPr>
-            </w:pPr>
-            <w:r>
-              <w:rPr>
-                <w:b w:val="0"/>
-                <w:sz w:val="24"/>
-                <w:szCs w:val="24"/>
-              </w:rPr>
-              <w:t>Hasil diagnosis di tiket</w:t>
+            <w:tcW w:w="2835" w:type="dxa"/>
+            <w:tcBorders>
+              <w:top w:val="single" w:sz="8" w:space="0" w:color="000000"/>
+              <w:left w:val="single" w:sz="8" w:space="0" w:color="000000"/>
+              <w:bottom w:val="single" w:sz="8" w:space="0" w:color="000000"/>
+              <w:right w:val="single" w:sz="8" w:space="0" w:color="000000"/>
+            </w:tcBorders>
+            <w:vAlign w:val="center"/>
+          </w:tcPr>
+          <w:p>
+            <w:pPr>
+              <w:jc w:val="left"/>
+              <w:rPr>
+                <w:sz w:val="24"/>
+                <w:szCs w:val="24"/>
+              </w:rPr>
+            </w:pPr>
+            <w:r>
+              <w:rPr>
+                <w:b w:val="0"/>
+                <w:sz w:val="24"/>
+                <w:szCs w:val="24"/>
+              </w:rPr>
+              <w:t>Hasil diagnosis di ticket</w:t>
             </w:r>
           </w:p>
         </w:tc>
       </w:tr>
       <w:tr>
         <w:trPr>
+          <w:cantSplit/>
           <w:jc w:val="center"/>
         </w:trPr>
         <w:tc>
           <w:tcPr>
-            <w:tcW w:w="3367" w:type="dxa"/>
-            <w:tcBorders>
-              <w:top w:val="single" w:sz="8" w:space="0" w:color="000000"/>
-              <w:left w:val="single" w:sz="8" w:space="0" w:color="000000"/>
-              <w:bottom w:val="single" w:sz="8" w:space="0" w:color="000000"/>
-              <w:right w:val="single" w:sz="8" w:space="0" w:color="000000"/>
-            </w:tcBorders>
-            <w:vAlign w:val="center"/>
-          </w:tcPr>
-          <w:p>
-            <w:pPr>
-              <w:rPr>
-                <w:sz w:val="24"/>
-                <w:szCs w:val="24"/>
-              </w:rPr>
-            </w:pPr>
-            <w:r>
-              <w:rPr>
-                <w:b w:val="0"/>
-                <w:sz w:val="24"/>
-                <w:szCs w:val="24"/>
-              </w:rPr>
-              <w:t>4. Jalankan perbaikan yang mengubah production melalui SNX-OPS-SOP-02; untuk pemulihan P1 boleh sebagai change Emergency.</w:t>
-            </w:r>
-          </w:p>
-        </w:tc>
-        <w:tc>
-          <w:tcPr>
-            <w:tcW w:w="2248" w:type="dxa"/>
+            <w:tcW w:w="4309" w:type="dxa"/>
+            <w:tcBorders>
+              <w:top w:val="single" w:sz="8" w:space="0" w:color="000000"/>
+              <w:left w:val="single" w:sz="8" w:space="0" w:color="000000"/>
+              <w:bottom w:val="single" w:sz="8" w:space="0" w:color="000000"/>
+              <w:right w:val="single" w:sz="8" w:space="0" w:color="000000"/>
+            </w:tcBorders>
+            <w:vAlign w:val="center"/>
+          </w:tcPr>
+          <w:p>
+            <w:pPr>
+              <w:rPr>
+                <w:sz w:val="24"/>
+                <w:szCs w:val="24"/>
+              </w:rPr>
+            </w:pPr>
+            <w:r>
+              <w:rPr>
+                <w:b w:val="0"/>
+                <w:sz w:val="24"/>
+                <w:szCs w:val="24"/>
+              </w:rPr>
+              <w:t>4. Jalankan perbaikan yang mengubah production melalui SNX-OPS-SOP-02. Pemulihan P1 boleh dijalankan sebagai change Emergency.</w:t>
+            </w:r>
+          </w:p>
+        </w:tc>
+        <w:tc>
+          <w:tcPr>
+            <w:tcW w:w="1927" w:type="dxa"/>
             <w:tcBorders>
               <w:top w:val="single" w:sz="8" w:space="0" w:color="000000"/>
               <w:left w:val="single" w:sz="8" w:space="0" w:color="000000"/>
@@ -6697,18 +6849,18 @@
         </w:tc>
         <w:tc>
           <w:tcPr>
-            <w:tcW w:w="3913" w:type="dxa"/>
-            <w:tcBorders>
-              <w:top w:val="single" w:sz="8" w:space="0" w:color="000000"/>
-              <w:left w:val="single" w:sz="8" w:space="0" w:color="000000"/>
-              <w:bottom w:val="single" w:sz="8" w:space="0" w:color="000000"/>
-              <w:right w:val="single" w:sz="8" w:space="0" w:color="000000"/>
-            </w:tcBorders>
-            <w:vAlign w:val="center"/>
-          </w:tcPr>
-          <w:p>
-            <w:pPr>
-              <w:jc w:val="both"/>
+            <w:tcW w:w="2835" w:type="dxa"/>
+            <w:tcBorders>
+              <w:top w:val="single" w:sz="8" w:space="0" w:color="000000"/>
+              <w:left w:val="single" w:sz="8" w:space="0" w:color="000000"/>
+              <w:bottom w:val="single" w:sz="8" w:space="0" w:color="000000"/>
+              <w:right w:val="single" w:sz="8" w:space="0" w:color="000000"/>
+            </w:tcBorders>
+            <w:vAlign w:val="center"/>
+          </w:tcPr>
+          <w:p>
+            <w:pPr>
+              <w:jc w:val="left"/>
               <w:rPr>
                 <w:sz w:val="24"/>
                 <w:szCs w:val="24"/>
@@ -6727,11 +6879,12 @@
       </w:tr>
       <w:tr>
         <w:trPr>
+          <w:cantSplit/>
           <w:jc w:val="center"/>
         </w:trPr>
         <w:tc>
           <w:tcPr>
-            <w:tcW w:w="3367" w:type="dxa"/>
+            <w:tcW w:w="4309" w:type="dxa"/>
             <w:tcBorders>
               <w:top w:val="single" w:sz="8" w:space="0" w:color="000000"/>
               <w:left w:val="single" w:sz="8" w:space="0" w:color="000000"/>
@@ -6759,7 +6912,7 @@
         </w:tc>
         <w:tc>
           <w:tcPr>
-            <w:tcW w:w="2248" w:type="dxa"/>
+            <w:tcW w:w="1927" w:type="dxa"/>
             <w:tcBorders>
               <w:top w:val="single" w:sz="8" w:space="0" w:color="000000"/>
               <w:left w:val="single" w:sz="8" w:space="0" w:color="000000"/>
@@ -6787,18 +6940,18 @@
         </w:tc>
         <w:tc>
           <w:tcPr>
-            <w:tcW w:w="3913" w:type="dxa"/>
-            <w:tcBorders>
-              <w:top w:val="single" w:sz="8" w:space="0" w:color="000000"/>
-              <w:left w:val="single" w:sz="8" w:space="0" w:color="000000"/>
-              <w:bottom w:val="single" w:sz="8" w:space="0" w:color="000000"/>
-              <w:right w:val="single" w:sz="8" w:space="0" w:color="000000"/>
-            </w:tcBorders>
-            <w:vAlign w:val="center"/>
-          </w:tcPr>
-          <w:p>
-            <w:pPr>
-              <w:jc w:val="both"/>
+            <w:tcW w:w="2835" w:type="dxa"/>
+            <w:tcBorders>
+              <w:top w:val="single" w:sz="8" w:space="0" w:color="000000"/>
+              <w:left w:val="single" w:sz="8" w:space="0" w:color="000000"/>
+              <w:bottom w:val="single" w:sz="8" w:space="0" w:color="000000"/>
+              <w:right w:val="single" w:sz="8" w:space="0" w:color="000000"/>
+            </w:tcBorders>
+            <w:vAlign w:val="center"/>
+          </w:tcPr>
+          <w:p>
+            <w:pPr>
+              <w:jc w:val="left"/>
               <w:rPr>
                 <w:sz w:val="24"/>
                 <w:szCs w:val="24"/>
@@ -6817,11 +6970,12 @@
       </w:tr>
       <w:tr>
         <w:trPr>
+          <w:cantSplit/>
           <w:jc w:val="center"/>
         </w:trPr>
         <w:tc>
           <w:tcPr>
-            <w:tcW w:w="3367" w:type="dxa"/>
+            <w:tcW w:w="4309" w:type="dxa"/>
             <w:tcBorders>
               <w:top w:val="single" w:sz="8" w:space="0" w:color="000000"/>
               <w:left w:val="single" w:sz="8" w:space="0" w:color="000000"/>
@@ -6849,7 +7003,7 @@
         </w:tc>
         <w:tc>
           <w:tcPr>
-            <w:tcW w:w="2248" w:type="dxa"/>
+            <w:tcW w:w="1927" w:type="dxa"/>
             <w:tcBorders>
               <w:top w:val="single" w:sz="8" w:space="0" w:color="000000"/>
               <w:left w:val="single" w:sz="8" w:space="0" w:color="000000"/>
@@ -6877,18 +7031,18 @@
         </w:tc>
         <w:tc>
           <w:tcPr>
-            <w:tcW w:w="3913" w:type="dxa"/>
-            <w:tcBorders>
-              <w:top w:val="single" w:sz="8" w:space="0" w:color="000000"/>
-              <w:left w:val="single" w:sz="8" w:space="0" w:color="000000"/>
-              <w:bottom w:val="single" w:sz="8" w:space="0" w:color="000000"/>
-              <w:right w:val="single" w:sz="8" w:space="0" w:color="000000"/>
-            </w:tcBorders>
-            <w:vAlign w:val="center"/>
-          </w:tcPr>
-          <w:p>
-            <w:pPr>
-              <w:jc w:val="both"/>
+            <w:tcW w:w="2835" w:type="dxa"/>
+            <w:tcBorders>
+              <w:top w:val="single" w:sz="8" w:space="0" w:color="000000"/>
+              <w:left w:val="single" w:sz="8" w:space="0" w:color="000000"/>
+              <w:bottom w:val="single" w:sz="8" w:space="0" w:color="000000"/>
+              <w:right w:val="single" w:sz="8" w:space="0" w:color="000000"/>
+            </w:tcBorders>
+            <w:vAlign w:val="center"/>
+          </w:tcPr>
+          <w:p>
+            <w:pPr>
+              <w:jc w:val="left"/>
               <w:rPr>
                 <w:sz w:val="24"/>
                 <w:szCs w:val="24"/>
@@ -6907,11 +7061,12 @@
       </w:tr>
       <w:tr>
         <w:trPr>
+          <w:cantSplit/>
           <w:jc w:val="center"/>
         </w:trPr>
         <w:tc>
           <w:tcPr>
-            <w:tcW w:w="3367" w:type="dxa"/>
+            <w:tcW w:w="4309" w:type="dxa"/>
             <w:tcBorders>
               <w:top w:val="single" w:sz="8" w:space="0" w:color="000000"/>
               <w:left w:val="single" w:sz="8" w:space="0" w:color="000000"/>
@@ -6939,7 +7094,7 @@
         </w:tc>
         <w:tc>
           <w:tcPr>
-            <w:tcW w:w="2248" w:type="dxa"/>
+            <w:tcW w:w="1927" w:type="dxa"/>
             <w:tcBorders>
               <w:top w:val="single" w:sz="8" w:space="0" w:color="000000"/>
               <w:left w:val="single" w:sz="8" w:space="0" w:color="000000"/>
@@ -6967,18 +7122,18 @@
         </w:tc>
         <w:tc>
           <w:tcPr>
-            <w:tcW w:w="3913" w:type="dxa"/>
-            <w:tcBorders>
-              <w:top w:val="single" w:sz="8" w:space="0" w:color="000000"/>
-              <w:left w:val="single" w:sz="8" w:space="0" w:color="000000"/>
-              <w:bottom w:val="single" w:sz="8" w:space="0" w:color="000000"/>
-              <w:right w:val="single" w:sz="8" w:space="0" w:color="000000"/>
-            </w:tcBorders>
-            <w:vAlign w:val="center"/>
-          </w:tcPr>
-          <w:p>
-            <w:pPr>
-              <w:jc w:val="both"/>
+            <w:tcW w:w="2835" w:type="dxa"/>
+            <w:tcBorders>
+              <w:top w:val="single" w:sz="8" w:space="0" w:color="000000"/>
+              <w:left w:val="single" w:sz="8" w:space="0" w:color="000000"/>
+              <w:bottom w:val="single" w:sz="8" w:space="0" w:color="000000"/>
+              <w:right w:val="single" w:sz="8" w:space="0" w:color="000000"/>
+            </w:tcBorders>
+            <w:vAlign w:val="center"/>
+          </w:tcPr>
+          <w:p>
+            <w:pPr>
+              <w:jc w:val="left"/>
               <w:rPr>
                 <w:sz w:val="24"/>
                 <w:szCs w:val="24"/>
@@ -6997,39 +7152,40 @@
       </w:tr>
       <w:tr>
         <w:trPr>
+          <w:cantSplit/>
           <w:jc w:val="center"/>
         </w:trPr>
         <w:tc>
           <w:tcPr>
-            <w:tcW w:w="3367" w:type="dxa"/>
-            <w:tcBorders>
-              <w:top w:val="single" w:sz="8" w:space="0" w:color="000000"/>
-              <w:left w:val="single" w:sz="8" w:space="0" w:color="000000"/>
-              <w:bottom w:val="single" w:sz="8" w:space="0" w:color="000000"/>
-              <w:right w:val="single" w:sz="8" w:space="0" w:color="000000"/>
-            </w:tcBorders>
-            <w:vAlign w:val="center"/>
-          </w:tcPr>
-          <w:p>
-            <w:pPr>
-              <w:rPr>
-                <w:sz w:val="24"/>
-                <w:szCs w:val="24"/>
-              </w:rPr>
-            </w:pPr>
-            <w:r>
-              <w:rPr>
-                <w:b w:val="0"/>
-                <w:sz w:val="24"/>
-                <w:szCs w:val="24"/>
-              </w:rPr>
-              <w:t>8. Tutup tiket di Zammad.</w:t>
-            </w:r>
-          </w:p>
-        </w:tc>
-        <w:tc>
-          <w:tcPr>
-            <w:tcW w:w="2248" w:type="dxa"/>
+            <w:tcW w:w="4309" w:type="dxa"/>
+            <w:tcBorders>
+              <w:top w:val="single" w:sz="8" w:space="0" w:color="000000"/>
+              <w:left w:val="single" w:sz="8" w:space="0" w:color="000000"/>
+              <w:bottom w:val="single" w:sz="8" w:space="0" w:color="000000"/>
+              <w:right w:val="single" w:sz="8" w:space="0" w:color="000000"/>
+            </w:tcBorders>
+            <w:vAlign w:val="center"/>
+          </w:tcPr>
+          <w:p>
+            <w:pPr>
+              <w:rPr>
+                <w:sz w:val="24"/>
+                <w:szCs w:val="24"/>
+              </w:rPr>
+            </w:pPr>
+            <w:r>
+              <w:rPr>
+                <w:b w:val="0"/>
+                <w:sz w:val="24"/>
+                <w:szCs w:val="24"/>
+              </w:rPr>
+              <w:t>8. Tutup ticket di Zammad.</w:t>
+            </w:r>
+          </w:p>
+        </w:tc>
+        <w:tc>
+          <w:tcPr>
+            <w:tcW w:w="1927" w:type="dxa"/>
             <w:tcBorders>
               <w:top w:val="single" w:sz="8" w:space="0" w:color="000000"/>
               <w:left w:val="single" w:sz="8" w:space="0" w:color="000000"/>
@@ -7057,69 +7213,70 @@
         </w:tc>
         <w:tc>
           <w:tcPr>
-            <w:tcW w:w="3913" w:type="dxa"/>
-            <w:tcBorders>
-              <w:top w:val="single" w:sz="8" w:space="0" w:color="000000"/>
-              <w:left w:val="single" w:sz="8" w:space="0" w:color="000000"/>
-              <w:bottom w:val="single" w:sz="8" w:space="0" w:color="000000"/>
-              <w:right w:val="single" w:sz="8" w:space="0" w:color="000000"/>
-            </w:tcBorders>
-            <w:vAlign w:val="center"/>
-          </w:tcPr>
-          <w:p>
-            <w:pPr>
-              <w:jc w:val="both"/>
-              <w:rPr>
-                <w:sz w:val="24"/>
-                <w:szCs w:val="24"/>
-              </w:rPr>
-            </w:pPr>
-            <w:r>
-              <w:rPr>
-                <w:b w:val="0"/>
-                <w:sz w:val="24"/>
-                <w:szCs w:val="24"/>
-              </w:rPr>
-              <w:t>Tiket tertutup</w:t>
+            <w:tcW w:w="2835" w:type="dxa"/>
+            <w:tcBorders>
+              <w:top w:val="single" w:sz="8" w:space="0" w:color="000000"/>
+              <w:left w:val="single" w:sz="8" w:space="0" w:color="000000"/>
+              <w:bottom w:val="single" w:sz="8" w:space="0" w:color="000000"/>
+              <w:right w:val="single" w:sz="8" w:space="0" w:color="000000"/>
+            </w:tcBorders>
+            <w:vAlign w:val="center"/>
+          </w:tcPr>
+          <w:p>
+            <w:pPr>
+              <w:jc w:val="left"/>
+              <w:rPr>
+                <w:sz w:val="24"/>
+                <w:szCs w:val="24"/>
+              </w:rPr>
+            </w:pPr>
+            <w:r>
+              <w:rPr>
+                <w:b w:val="0"/>
+                <w:sz w:val="24"/>
+                <w:szCs w:val="24"/>
+              </w:rPr>
+              <w:t>Ticket tertutup</w:t>
             </w:r>
           </w:p>
         </w:tc>
       </w:tr>
       <w:tr>
         <w:trPr>
+          <w:cantSplit/>
           <w:jc w:val="center"/>
         </w:trPr>
         <w:tc>
           <w:tcPr>
-            <w:tcW w:w="3367" w:type="dxa"/>
-            <w:tcBorders>
-              <w:top w:val="single" w:sz="8" w:space="0" w:color="000000"/>
-              <w:left w:val="single" w:sz="8" w:space="0" w:color="000000"/>
-              <w:bottom w:val="single" w:sz="8" w:space="0" w:color="000000"/>
-              <w:right w:val="single" w:sz="8" w:space="0" w:color="000000"/>
-            </w:tcBorders>
-            <w:vAlign w:val="center"/>
-          </w:tcPr>
-          <w:p>
-            <w:pPr>
-              <w:rPr>
-                <w:sz w:val="24"/>
-                <w:szCs w:val="24"/>
-              </w:rPr>
-            </w:pPr>
-            <w:r>
-              <w:rPr>
-                <w:b w:val="0"/>
-                <w:sz w:val="24"/>
-                <w:szCs w:val="24"/>
-              </w:rPr>
-              <w:t>9. Bila perangkat atau media penyimpanan diganti atau dibuang, ikuti SNX-ISMS-SOP-04 (penghapusan data aman).</w:t>
-            </w:r>
-          </w:p>
-        </w:tc>
-        <w:tc>
-          <w:tcPr>
-            <w:tcW w:w="2248" w:type="dxa"/>
+            <w:tcW w:w="4309" w:type="dxa"/>
+            <w:tcBorders>
+              <w:top w:val="single" w:sz="8" w:space="0" w:color="000000"/>
+              <w:left w:val="single" w:sz="8" w:space="0" w:color="000000"/>
+              <w:bottom w:val="single" w:sz="8" w:space="0" w:color="000000"/>
+              <w:right w:val="single" w:sz="8" w:space="0" w:color="000000"/>
+            </w:tcBorders>
+            <w:vAlign w:val="center"/>
+          </w:tcPr>
+          <w:p>
+            <w:pPr>
+              <w:rPr>
+                <w:sz w:val="24"/>
+                <w:szCs w:val="24"/>
+              </w:rPr>
+            </w:pPr>
+            <w:r>
+              <w:rPr>
+                <w:b w:val="0"/>
+                <w:sz w:val="24"/>
+                <w:szCs w:val="24"/>
+              </w:rPr>
+              <w:t>9. Jika perangkat atau media penyimpanan diganti atau dibuang, ikuti SNX-ISMS-SOP-04 (penghapusan data aman).</w:t>
+            </w:r>
+          </w:p>
+        </w:tc>
+        <w:tc>
+          <w:tcPr>
+            <w:tcW w:w="1927" w:type="dxa"/>
             <w:tcBorders>
               <w:top w:val="single" w:sz="8" w:space="0" w:color="000000"/>
               <w:left w:val="single" w:sz="8" w:space="0" w:color="000000"/>
@@ -7147,30 +7304,30 @@
         </w:tc>
         <w:tc>
           <w:tcPr>
-            <w:tcW w:w="3913" w:type="dxa"/>
-            <w:tcBorders>
-              <w:top w:val="single" w:sz="8" w:space="0" w:color="000000"/>
-              <w:left w:val="single" w:sz="8" w:space="0" w:color="000000"/>
-              <w:bottom w:val="single" w:sz="8" w:space="0" w:color="000000"/>
-              <w:right w:val="single" w:sz="8" w:space="0" w:color="000000"/>
-            </w:tcBorders>
-            <w:vAlign w:val="center"/>
-          </w:tcPr>
-          <w:p>
-            <w:pPr>
-              <w:jc w:val="both"/>
-              <w:rPr>
-                <w:sz w:val="24"/>
-                <w:szCs w:val="24"/>
-              </w:rPr>
-            </w:pPr>
-            <w:r>
-              <w:rPr>
-                <w:b w:val="0"/>
-                <w:sz w:val="24"/>
-                <w:szCs w:val="24"/>
-              </w:rPr>
-              <w:t>Rekaman penghapusan data sesuai SNX-ISMS-SOP-04</w:t>
+            <w:tcW w:w="2835" w:type="dxa"/>
+            <w:tcBorders>
+              <w:top w:val="single" w:sz="8" w:space="0" w:color="000000"/>
+              <w:left w:val="single" w:sz="8" w:space="0" w:color="000000"/>
+              <w:bottom w:val="single" w:sz="8" w:space="0" w:color="000000"/>
+              <w:right w:val="single" w:sz="8" w:space="0" w:color="000000"/>
+            </w:tcBorders>
+            <w:vAlign w:val="center"/>
+          </w:tcPr>
+          <w:p>
+            <w:pPr>
+              <w:jc w:val="left"/>
+              <w:rPr>
+                <w:sz w:val="24"/>
+                <w:szCs w:val="24"/>
+              </w:rPr>
+            </w:pPr>
+            <w:r>
+              <w:rPr>
+                <w:b w:val="0"/>
+                <w:sz w:val="24"/>
+                <w:szCs w:val="24"/>
+              </w:rPr>
+              <w:t>Record penghapusan data sesuai SNX-ISMS-SOP-04</w:t>
             </w:r>
           </w:p>
         </w:tc>
@@ -7331,6 +7488,7 @@
     <w:p>
       <w:pPr>
         <w:pStyle w:val="Heading1"/>
+        <w:keepNext/>
         <w:numPr>
           <w:ilvl w:val="0"/>
           <w:numId w:val="7"/>
@@ -7359,6 +7517,8 @@
       </w:tblGrid>
       <w:tr>
         <w:trPr>
+          <w:cantSplit/>
+          <w:tblHeader/>
           <w:jc w:val="center"/>
         </w:trPr>
         <w:tc>
@@ -7374,6 +7534,7 @@
           </w:tcPr>
           <w:p>
             <w:pPr>
+              <w:keepNext/>
               <w:jc w:val="center"/>
               <w:rPr>
                 <w:sz w:val="24"/>
@@ -7404,6 +7565,7 @@
           </w:tcPr>
           <w:p>
             <w:pPr>
+              <w:keepNext/>
               <w:jc w:val="center"/>
               <w:rPr>
                 <w:sz w:val="24"/>
@@ -7434,6 +7596,7 @@
           </w:tcPr>
           <w:p>
             <w:pPr>
+              <w:keepNext/>
               <w:jc w:val="center"/>
               <w:rPr>
                 <w:sz w:val="24"/>
@@ -7454,6 +7617,7 @@
       </w:tr>
       <w:tr>
         <w:trPr>
+          <w:cantSplit/>
           <w:jc w:val="center"/>
         </w:trPr>
         <w:tc>
@@ -7525,7 +7689,7 @@
           </w:tcPr>
           <w:p>
             <w:pPr>
-              <w:jc w:val="both"/>
+              <w:jc w:val="left"/>
               <w:rPr>
                 <w:sz w:val="24"/>
                 <w:szCs w:val="24"/>
@@ -7544,6 +7708,7 @@
       </w:tr>
       <w:tr>
         <w:trPr>
+          <w:cantSplit/>
           <w:jc w:val="center"/>
         </w:trPr>
         <w:tc>
@@ -7615,7 +7780,7 @@
           </w:tcPr>
           <w:p>
             <w:pPr>
-              <w:jc w:val="both"/>
+              <w:jc w:val="left"/>
               <w:rPr>
                 <w:sz w:val="24"/>
                 <w:szCs w:val="24"/>
@@ -7634,6 +7799,7 @@
       </w:tr>
       <w:tr>
         <w:trPr>
+          <w:cantSplit/>
           <w:jc w:val="center"/>
         </w:trPr>
         <w:tc>
@@ -7705,7 +7871,7 @@
           </w:tcPr>
           <w:p>
             <w:pPr>
-              <w:jc w:val="both"/>
+              <w:jc w:val="left"/>
               <w:rPr>
                 <w:sz w:val="24"/>
                 <w:szCs w:val="24"/>
@@ -7724,6 +7890,7 @@
       </w:tr>
       <w:tr>
         <w:trPr>
+          <w:cantSplit/>
           <w:jc w:val="center"/>
         </w:trPr>
         <w:tc>
@@ -7795,7 +7962,7 @@
           </w:tcPr>
           <w:p>
             <w:pPr>
-              <w:jc w:val="both"/>
+              <w:jc w:val="left"/>
               <w:rPr>
                 <w:sz w:val="24"/>
                 <w:szCs w:val="24"/>
@@ -7814,6 +7981,7 @@
       </w:tr>
       <w:tr>
         <w:trPr>
+          <w:cantSplit/>
           <w:jc w:val="center"/>
         </w:trPr>
         <w:tc>
@@ -7885,7 +8053,7 @@
           </w:tcPr>
           <w:p>
             <w:pPr>
-              <w:jc w:val="both"/>
+              <w:jc w:val="left"/>
               <w:rPr>
                 <w:sz w:val="24"/>
                 <w:szCs w:val="24"/>
@@ -7904,6 +8072,7 @@
       </w:tr>
       <w:tr>
         <w:trPr>
+          <w:cantSplit/>
           <w:jc w:val="center"/>
         </w:trPr>
         <w:tc>
@@ -7975,7 +8144,7 @@
           </w:tcPr>
           <w:p>
             <w:pPr>
-              <w:jc w:val="both"/>
+              <w:jc w:val="left"/>
               <w:rPr>
                 <w:sz w:val="24"/>
                 <w:szCs w:val="24"/>
@@ -7994,6 +8163,7 @@
       </w:tr>
       <w:tr>
         <w:trPr>
+          <w:cantSplit/>
           <w:jc w:val="center"/>
         </w:trPr>
         <w:tc>
@@ -8065,7 +8235,7 @@
           </w:tcPr>
           <w:p>
             <w:pPr>
-              <w:jc w:val="both"/>
+              <w:jc w:val="left"/>
               <w:rPr>
                 <w:sz w:val="24"/>
                 <w:szCs w:val="24"/>
@@ -8084,6 +8254,7 @@
       </w:tr>
       <w:tr>
         <w:trPr>
+          <w:cantSplit/>
           <w:jc w:val="center"/>
         </w:trPr>
         <w:tc>
@@ -8155,7 +8326,7 @@
           </w:tcPr>
           <w:p>
             <w:pPr>
-              <w:jc w:val="both"/>
+              <w:jc w:val="left"/>
               <w:rPr>
                 <w:sz w:val="24"/>
                 <w:szCs w:val="24"/>
@@ -8174,6 +8345,7 @@
       </w:tr>
       <w:tr>
         <w:trPr>
+          <w:cantSplit/>
           <w:jc w:val="center"/>
         </w:trPr>
         <w:tc>
@@ -8245,7 +8417,7 @@
           </w:tcPr>
           <w:p>
             <w:pPr>
-              <w:jc w:val="both"/>
+              <w:jc w:val="left"/>
               <w:rPr>
                 <w:sz w:val="24"/>
                 <w:szCs w:val="24"/>
@@ -8264,6 +8436,7 @@
       </w:tr>
       <w:tr>
         <w:trPr>
+          <w:cantSplit/>
           <w:jc w:val="center"/>
         </w:trPr>
         <w:tc>
@@ -8335,7 +8508,7 @@
           </w:tcPr>
           <w:p>
             <w:pPr>
-              <w:jc w:val="both"/>
+              <w:jc w:val="left"/>
               <w:rPr>
                 <w:sz w:val="24"/>
                 <w:szCs w:val="24"/>
@@ -8354,6 +8527,7 @@
       </w:tr>
       <w:tr>
         <w:trPr>
+          <w:cantSplit/>
           <w:jc w:val="center"/>
         </w:trPr>
         <w:tc>
@@ -8425,7 +8599,7 @@
           </w:tcPr>
           <w:p>
             <w:pPr>
-              <w:jc w:val="both"/>
+              <w:jc w:val="left"/>
               <w:rPr>
                 <w:sz w:val="24"/>
                 <w:szCs w:val="24"/>
@@ -8444,6 +8618,7 @@
       </w:tr>
       <w:tr>
         <w:trPr>
+          <w:cantSplit/>
           <w:jc w:val="center"/>
         </w:trPr>
         <w:tc>
@@ -8470,7 +8645,7 @@
                 <w:sz w:val="24"/>
                 <w:szCs w:val="24"/>
               </w:rPr>
-              <w:t>Tinjauan kepatuhan jadwal PM</w:t>
+              <w:t>Review kepatuhan jadwal PM</w:t>
             </w:r>
           </w:p>
         </w:tc>
@@ -8515,7 +8690,7 @@
           </w:tcPr>
           <w:p>
             <w:pPr>
-              <w:jc w:val="both"/>
+              <w:jc w:val="left"/>
               <w:rPr>
                 <w:sz w:val="24"/>
                 <w:szCs w:val="24"/>
@@ -8534,6 +8709,7 @@
       </w:tr>
       <w:tr>
         <w:trPr>
+          <w:cantSplit/>
           <w:jc w:val="center"/>
         </w:trPr>
         <w:tc>
@@ -8560,7 +8736,7 @@
                 <w:sz w:val="24"/>
                 <w:szCs w:val="24"/>
               </w:rPr>
-              <w:t>Tinjauan insiden akibat kerusakan yang seharusnya terdeteksi PM</w:t>
+              <w:t>Review insiden akibat kerusakan yang seharusnya terdeteksi PM</w:t>
             </w:r>
           </w:p>
         </w:tc>
@@ -8605,7 +8781,7 @@
           </w:tcPr>
           <w:p>
             <w:pPr>
-              <w:jc w:val="both"/>
+              <w:jc w:val="left"/>
               <w:rPr>
                 <w:sz w:val="24"/>
                 <w:szCs w:val="24"/>
@@ -8624,6 +8800,7 @@
       </w:tr>
       <w:tr>
         <w:trPr>
+          <w:cantSplit/>
           <w:jc w:val="center"/>
         </w:trPr>
         <w:tc>
@@ -8650,7 +8827,7 @@
                 <w:sz w:val="24"/>
                 <w:szCs w:val="24"/>
               </w:rPr>
-              <w:t>Respons, update ke pelanggan, dan target pulih tiket CM</w:t>
+              <w:t>Respons, update ke pelanggan, dan target pulih ticket CM</w:t>
             </w:r>
           </w:p>
         </w:tc>
@@ -8695,7 +8872,7 @@
           </w:tcPr>
           <w:p>
             <w:pPr>
-              <w:jc w:val="both"/>
+              <w:jc w:val="left"/>
               <w:rPr>
                 <w:sz w:val="24"/>
                 <w:szCs w:val="24"/>
@@ -8724,6 +8901,7 @@
     <w:p>
       <w:pPr>
         <w:pStyle w:val="Heading1"/>
+        <w:keepNext/>
         <w:numPr>
           <w:ilvl w:val="0"/>
           <w:numId w:val="7"/>
@@ -8756,6 +8934,10 @@
         <w:gridCol w:w="6765"/>
       </w:tblGrid>
       <w:tr>
+        <w:trPr>
+          <w:cantSplit/>
+          <w:tblHeader/>
+        </w:trPr>
         <w:tc>
           <w:tcPr>
             <w:tcW w:w="2745" w:type="dxa"/>
@@ -8768,6 +8950,7 @@
           </w:tcPr>
           <w:p>
             <w:pPr>
+              <w:keepNext/>
               <w:spacing w:after="120" w:line="252" w:lineRule="auto"/>
               <w:rPr>
                 <w:sz w:val="24"/>
@@ -8796,8 +8979,9 @@
           </w:tcPr>
           <w:p>
             <w:pPr>
+              <w:keepNext/>
               <w:spacing w:after="120" w:line="252" w:lineRule="auto"/>
-              <w:jc w:val="both"/>
+              <w:jc w:val="left"/>
               <w:rPr>
                 <w:sz w:val="24"/>
                 <w:szCs w:val="24"/>
@@ -8815,6 +8999,9 @@
         </w:tc>
       </w:tr>
       <w:tr>
+        <w:trPr>
+          <w:cantSplit/>
+        </w:trPr>
         <w:tc>
           <w:tcPr>
             <w:tcW w:w="2745" w:type="dxa"/>
@@ -8856,7 +9043,7 @@
           <w:p>
             <w:pPr>
               <w:spacing w:after="120" w:line="252" w:lineRule="auto"/>
-              <w:jc w:val="both"/>
+              <w:jc w:val="left"/>
               <w:rPr>
                 <w:sz w:val="24"/>
                 <w:szCs w:val="24"/>
@@ -8874,6 +9061,9 @@
         </w:tc>
       </w:tr>
       <w:tr>
+        <w:trPr>
+          <w:cantSplit/>
+        </w:trPr>
         <w:tc>
           <w:tcPr>
             <w:tcW w:w="2745" w:type="dxa"/>
@@ -8915,7 +9105,7 @@
           <w:p>
             <w:pPr>
               <w:spacing w:after="120" w:line="252" w:lineRule="auto"/>
-              <w:jc w:val="both"/>
+              <w:jc w:val="left"/>
               <w:rPr>
                 <w:sz w:val="24"/>
                 <w:szCs w:val="24"/>
@@ -8933,6 +9123,9 @@
         </w:tc>
       </w:tr>
       <w:tr>
+        <w:trPr>
+          <w:cantSplit/>
+        </w:trPr>
         <w:tc>
           <w:tcPr>
             <w:tcW w:w="2745" w:type="dxa"/>
@@ -8974,24 +9167,27 @@
           <w:p>
             <w:pPr>
               <w:spacing w:after="120" w:line="252" w:lineRule="auto"/>
-              <w:jc w:val="both"/>
-              <w:rPr>
-                <w:sz w:val="24"/>
-                <w:szCs w:val="24"/>
-              </w:rPr>
-            </w:pPr>
-            <w:r>
-              <w:rPr>
-                <w:b w:val="0"/>
-                <w:sz w:val="24"/>
-                <w:szCs w:val="24"/>
-              </w:rPr>
-              <w:t>NOC Engineer mengeskalasi ke penyedia DC atau upstream sesuai matriks eskalasi SNX-OPS-SOP-04. Penyedia memperbaiki sesuai kontrak (butir 6.4).</w:t>
+              <w:jc w:val="left"/>
+              <w:rPr>
+                <w:sz w:val="24"/>
+                <w:szCs w:val="24"/>
+              </w:rPr>
+            </w:pPr>
+            <w:r>
+              <w:rPr>
+                <w:b w:val="0"/>
+                <w:sz w:val="24"/>
+                <w:szCs w:val="24"/>
+              </w:rPr>
+              <w:t>NOC Engineer mengeskalasi ke penyedia DC atau upstream, lalu menuntaskan ticket sesuai butir 6.4. Perbaikan oleh penyedia mengikuti kontraknya.</w:t>
             </w:r>
           </w:p>
         </w:tc>
       </w:tr>
       <w:tr>
+        <w:trPr>
+          <w:cantSplit/>
+        </w:trPr>
         <w:tc>
           <w:tcPr>
             <w:tcW w:w="2745" w:type="dxa"/>
@@ -9033,24 +9229,27 @@
           <w:p>
             <w:pPr>
               <w:spacing w:after="120" w:line="252" w:lineRule="auto"/>
-              <w:jc w:val="both"/>
-              <w:rPr>
-                <w:sz w:val="24"/>
-                <w:szCs w:val="24"/>
-              </w:rPr>
-            </w:pPr>
-            <w:r>
-              <w:rPr>
-                <w:b w:val="0"/>
-                <w:sz w:val="24"/>
-                <w:szCs w:val="24"/>
-              </w:rPr>
-              <w:t>NOC Engineer menyerahkan ke developer atau PIC pelanggan. SOP ini tidak mengatur perbaikannya.</w:t>
+              <w:jc w:val="left"/>
+              <w:rPr>
+                <w:sz w:val="24"/>
+                <w:szCs w:val="24"/>
+              </w:rPr>
+            </w:pPr>
+            <w:r>
+              <w:rPr>
+                <w:b w:val="0"/>
+                <w:sz w:val="24"/>
+                <w:szCs w:val="24"/>
+              </w:rPr>
+              <w:t>NOC Engineer menyerahkan penanganan ke developer atau PIC pelanggan. Perbaikannya di luar cakupan SOP ini.</w:t>
             </w:r>
           </w:p>
         </w:tc>
       </w:tr>
       <w:tr>
+        <w:trPr>
+          <w:cantSplit/>
+        </w:trPr>
         <w:tc>
           <w:tcPr>
             <w:tcW w:w="2745" w:type="dxa"/>
@@ -9092,24 +9291,27 @@
           <w:p>
             <w:pPr>
               <w:spacing w:after="120" w:line="252" w:lineRule="auto"/>
-              <w:jc w:val="both"/>
-              <w:rPr>
-                <w:sz w:val="24"/>
-                <w:szCs w:val="24"/>
-              </w:rPr>
-            </w:pPr>
-            <w:r>
-              <w:rPr>
-                <w:b w:val="0"/>
-                <w:sz w:val="24"/>
-                <w:szCs w:val="24"/>
-              </w:rPr>
-              <w:t>NOC Engineer menandai kode T di sheet Jadwal PM. Lead NOC meninjaunya pada tinjauan kepatuhan bulanan (butir 6.3).</w:t>
+              <w:jc w:val="left"/>
+              <w:rPr>
+                <w:sz w:val="24"/>
+                <w:szCs w:val="24"/>
+              </w:rPr>
+            </w:pPr>
+            <w:r>
+              <w:rPr>
+                <w:b w:val="0"/>
+                <w:sz w:val="24"/>
+                <w:szCs w:val="24"/>
+              </w:rPr>
+              <w:t>NOC Engineer menandai kode T di sheet Jadwal PM. Kode itu ditinjau Lead NOC pada review kepatuhan bulanan (butir 6.3).</w:t>
             </w:r>
           </w:p>
         </w:tc>
       </w:tr>
       <w:tr>
+        <w:trPr>
+          <w:cantSplit/>
+        </w:trPr>
         <w:tc>
           <w:tcPr>
             <w:tcW w:w="2745" w:type="dxa"/>
@@ -9151,7 +9353,7 @@
           <w:p>
             <w:pPr>
               <w:spacing w:after="120" w:line="252" w:lineRule="auto"/>
-              <w:jc w:val="both"/>
+              <w:jc w:val="left"/>
               <w:rPr>
                 <w:sz w:val="24"/>
                 <w:szCs w:val="24"/>
@@ -9222,7 +9424,7 @@
           <w:sz w:val="24"/>
           <w:szCs w:val="24"/>
         </w:rPr>
-        <w:t xml:space="preserve">Lead NOC memantau kepatuhan terhadap SOP ini lewat tinjauan kepatuhan jadwal PM bulanan di SNX-OPS-FRM-07.</w:t>
+        <w:t xml:space="preserve">Lead NOC memantau kepatuhan terhadap SOP ini melalui review kepatuhan jadwal PM bulanan di SNX-OPS-FRM-07.</w:t>
       </w:r>
     </w:p>
     <w:p>
@@ -9298,6 +9500,7 @@
     </w:p>
     <w:p>
       <w:pPr>
+        <w:keepNext/>
         <w:pBdr>
           <w:top w:val="nil"/>
           <w:left w:val="nil"/>
@@ -9344,6 +9547,8 @@
       </w:tblGrid>
       <w:tr>
         <w:trPr>
+          <w:cantSplit/>
+          <w:tblHeader/>
           <w:jc w:val="center"/>
         </w:trPr>
         <w:tc>
@@ -9353,6 +9558,7 @@
           </w:tcPr>
           <w:p>
             <w:pPr>
+              <w:keepNext/>
               <w:jc w:val="center"/>
               <w:rPr>
                 <w:sz w:val="24"/>
@@ -9377,6 +9583,7 @@
           </w:tcPr>
           <w:p>
             <w:pPr>
+              <w:keepNext/>
               <w:jc w:val="center"/>
               <w:rPr>
                 <w:sz w:val="24"/>
@@ -9397,6 +9604,7 @@
       </w:tr>
       <w:tr>
         <w:trPr>
+          <w:cantSplit/>
           <w:jc w:val="center"/>
         </w:trPr>
         <w:tc>
@@ -9446,6 +9654,7 @@
       </w:tr>
       <w:tr>
         <w:trPr>
+          <w:cantSplit/>
           <w:jc w:val="center"/>
         </w:trPr>
         <w:tc>
@@ -9495,6 +9704,7 @@
       </w:tr>
       <w:tr>
         <w:trPr>
+          <w:cantSplit/>
           <w:jc w:val="center"/>
         </w:trPr>
         <w:tc>
@@ -9544,6 +9754,7 @@
       </w:tr>
       <w:tr>
         <w:trPr>
+          <w:cantSplit/>
           <w:jc w:val="center"/>
         </w:trPr>
         <w:tc>
@@ -9593,6 +9804,7 @@
       </w:tr>
       <w:tr>
         <w:trPr>
+          <w:cantSplit/>
           <w:jc w:val="center"/>
         </w:trPr>
         <w:tc>
@@ -9642,6 +9854,7 @@
       </w:tr>
       <w:tr>
         <w:trPr>
+          <w:cantSplit/>
           <w:jc w:val="center"/>
         </w:trPr>
         <w:tc>
@@ -9691,6 +9904,7 @@
       </w:tr>
       <w:tr>
         <w:trPr>
+          <w:cantSplit/>
           <w:jc w:val="center"/>
         </w:trPr>
         <w:tc>
@@ -9733,13 +9947,14 @@
                 <w:sz w:val="24"/>
                 <w:szCs w:val="24"/>
               </w:rPr>
-              <w:t>Technical Ticket / Incident Register; rekap tiket CM.</w:t>
+              <w:t>Technical Ticket / Incident Register; rekap ticket CM.</w:t>
             </w:r>
           </w:p>
         </w:tc>
       </w:tr>
       <w:tr>
         <w:trPr>
+          <w:cantSplit/>
           <w:jc w:val="center"/>
         </w:trPr>
         <w:tc>
@@ -9789,6 +10004,7 @@
       </w:tr>
       <w:tr>
         <w:trPr>
+          <w:cantSplit/>
           <w:jc w:val="center"/>
         </w:trPr>
         <w:tc>
@@ -9838,6 +10054,7 @@
       </w:tr>
       <w:tr>
         <w:trPr>
+          <w:cantSplit/>
           <w:jc w:val="center"/>
         </w:trPr>
         <w:tc>
@@ -9887,6 +10104,7 @@
       </w:tr>
       <w:tr>
         <w:trPr>
+          <w:cantSplit/>
           <w:jc w:val="center"/>
         </w:trPr>
         <w:tc>
@@ -9936,6 +10154,7 @@
       </w:tr>
       <w:tr>
         <w:trPr>
+          <w:cantSplit/>
           <w:jc w:val="center"/>
         </w:trPr>
         <w:tc>
@@ -9985,6 +10204,7 @@
       </w:tr>
       <w:tr>
         <w:trPr>
+          <w:cantSplit/>
           <w:jc w:val="center"/>
         </w:trPr>
         <w:tc>
@@ -10035,6 +10255,7 @@
     </w:tbl>
     <w:p>
       <w:pPr>
+        <w:keepNext/>
         <w:pBdr>
           <w:top w:val="nil"/>
           <w:left w:val="nil"/>
@@ -10074,6 +10295,8 @@
       </w:tblGrid>
       <w:tr>
         <w:trPr>
+          <w:cantSplit/>
+          <w:tblHeader/>
           <w:jc w:val="center"/>
         </w:trPr>
         <w:tc>
@@ -10089,6 +10312,7 @@
           </w:tcPr>
           <w:p>
             <w:pPr>
+              <w:keepNext/>
               <w:jc w:val="center"/>
               <w:rPr>
                 <w:sz w:val="24"/>
@@ -10119,6 +10343,7 @@
           </w:tcPr>
           <w:p>
             <w:pPr>
+              <w:keepNext/>
               <w:jc w:val="center"/>
               <w:rPr>
                 <w:sz w:val="24"/>
@@ -10149,6 +10374,7 @@
           </w:tcPr>
           <w:p>
             <w:pPr>
+              <w:keepNext/>
               <w:jc w:val="center"/>
               <w:rPr>
                 <w:sz w:val="24"/>
@@ -10169,6 +10395,7 @@
       </w:tr>
       <w:tr>
         <w:trPr>
+          <w:cantSplit/>
           <w:jc w:val="center"/>
         </w:trPr>
         <w:tc>
@@ -10240,7 +10467,7 @@
           </w:tcPr>
           <w:p>
             <w:pPr>
-              <w:jc w:val="both"/>
+              <w:jc w:val="left"/>
               <w:rPr>
                 <w:sz w:val="24"/>
                 <w:szCs w:val="24"/>
@@ -10259,6 +10486,7 @@
       </w:tr>
       <w:tr>
         <w:trPr>
+          <w:cantSplit/>
           <w:jc w:val="center"/>
         </w:trPr>
         <w:tc>
@@ -10285,7 +10513,7 @@
                 <w:sz w:val="24"/>
                 <w:szCs w:val="24"/>
               </w:rPr>
-              <w:t>Tiket CM (Zammad dan rekap SNX-OPS-FRM-08)</w:t>
+              <w:t>Ticket CM (Zammad dan rekap SNX-OPS-FRM-08)</w:t>
             </w:r>
           </w:p>
         </w:tc>
@@ -10330,7 +10558,7 @@
           </w:tcPr>
           <w:p>
             <w:pPr>
-              <w:jc w:val="both"/>
+              <w:jc w:val="left"/>
               <w:rPr>
                 <w:sz w:val="24"/>
                 <w:szCs w:val="24"/>
@@ -10349,6 +10577,7 @@
       </w:tr>
       <w:tr>
         <w:trPr>
+          <w:cantSplit/>
           <w:jc w:val="center"/>
         </w:trPr>
         <w:tc>
@@ -10420,7 +10649,7 @@
           </w:tcPr>
           <w:p>
             <w:pPr>
-              <w:jc w:val="both"/>
+              <w:jc w:val="left"/>
               <w:rPr>
                 <w:sz w:val="24"/>
                 <w:szCs w:val="24"/>
@@ -10439,6 +10668,7 @@
       </w:tr>
       <w:tr>
         <w:trPr>
+          <w:cantSplit/>
           <w:jc w:val="center"/>
         </w:trPr>
         <w:tc>
@@ -10510,7 +10740,7 @@
           </w:tcPr>
           <w:p>
             <w:pPr>
-              <w:jc w:val="both"/>
+              <w:jc w:val="left"/>
               <w:rPr>
                 <w:sz w:val="24"/>
                 <w:szCs w:val="24"/>
@@ -10529,6 +10759,7 @@
       </w:tr>
       <w:tr>
         <w:trPr>
+          <w:cantSplit/>
           <w:jc w:val="center"/>
         </w:trPr>
         <w:tc>
@@ -10600,7 +10831,7 @@
           </w:tcPr>
           <w:p>
             <w:pPr>
-              <w:jc w:val="both"/>
+              <w:jc w:val="left"/>
               <w:rPr>
                 <w:sz w:val="24"/>
                 <w:szCs w:val="24"/>
@@ -10619,6 +10850,7 @@
       </w:tr>
       <w:tr>
         <w:trPr>
+          <w:cantSplit/>
           <w:jc w:val="center"/>
         </w:trPr>
         <w:tc>
@@ -10690,7 +10922,7 @@
           </w:tcPr>
           <w:p>
             <w:pPr>
-              <w:jc w:val="both"/>
+              <w:jc w:val="left"/>
               <w:rPr>
                 <w:sz w:val="24"/>
                 <w:szCs w:val="24"/>

</xml_diff>